<commit_message>
docs: agrega el logo de la PUCMM a la portada
</commit_message>
<xml_diff>
--- a/3_Informes/Practica1_Documento_Solucion.docx
+++ b/3_Informes/Practica1_Documento_Solucion.docx
@@ -5,1241 +5,7 @@
     <w:p>
       <w:pPr>
         <w:pStyle w:val="Normal"/>
-        <w:spacing w:lineRule="auto" w:line="276" w:before="720" w:after="0"/>
-        <w:jc w:val="center"/>
-        <w:rPr>
-          <w:rFonts w:ascii="Times New Roman" w:hAnsi="Times New Roman" w:eastAsia="Times New Roman"/>
-          <w:b/>
-          <w:sz w:val="32"/>
-        </w:rPr>
-      </w:pPr>
-      <w:r>
-        <w:rPr>
-          <w:rFonts w:eastAsia="Times New Roman"/>
-          <w:b/>
-          <w:sz w:val="32"/>
-        </w:rPr>
-        <w:t>Pontificia Universidad Católica Madre y Maestra</w:t>
-      </w:r>
-    </w:p>
-    <w:p>
-      <w:pPr>
-        <w:pStyle w:val="Normal"/>
-        <w:spacing w:lineRule="auto" w:line="276" w:before="0" w:after="0"/>
-        <w:jc w:val="center"/>
-        <w:rPr>
-          <w:rFonts w:ascii="Times New Roman" w:hAnsi="Times New Roman" w:eastAsia="Times New Roman"/>
-          <w:b w:val="false"/>
-          <w:sz w:val="24"/>
-        </w:rPr>
-      </w:pPr>
-      <w:r>
-        <w:rPr>
-          <w:rFonts w:eastAsia="Times New Roman"/>
-          <w:b w:val="false"/>
-          <w:sz w:val="24"/>
-        </w:rPr>
-        <w:t>Facultad de Ciencias e Ingeniería</w:t>
-      </w:r>
-    </w:p>
-    <w:p>
-      <w:pPr>
-        <w:pStyle w:val="Normal"/>
-        <w:spacing w:lineRule="auto" w:line="276" w:before="0" w:after="0"/>
-        <w:jc w:val="center"/>
-        <w:rPr>
-          <w:rFonts w:ascii="Times New Roman" w:hAnsi="Times New Roman" w:eastAsia="Times New Roman"/>
-          <w:b w:val="false"/>
-          <w:sz w:val="24"/>
-        </w:rPr>
-      </w:pPr>
-      <w:r>
-        <w:rPr>
-          <w:rFonts w:eastAsia="Times New Roman"/>
-          <w:b w:val="false"/>
-          <w:sz w:val="24"/>
-        </w:rPr>
-        <w:t>Escuela de Ingeniería en Computación y Telecomunicaciones</w:t>
-      </w:r>
-    </w:p>
-    <w:p>
-      <w:pPr>
-        <w:pStyle w:val="Normal"/>
-        <w:spacing w:lineRule="auto" w:line="276" w:before="800" w:after="0"/>
-        <w:jc w:val="center"/>
-        <w:rPr>
-          <w:rFonts w:ascii="Times New Roman" w:hAnsi="Times New Roman" w:eastAsia="Times New Roman"/>
-          <w:b w:val="false"/>
-          <w:sz w:val="24"/>
-        </w:rPr>
-      </w:pPr>
-      <w:r>
-        <w:rPr>
-          <w:rFonts w:eastAsia="Times New Roman"/>
-          <w:b w:val="false"/>
-          <w:sz w:val="24"/>
-        </w:rPr>
-        <w:t>ICC-321-T Inteligencia de Negocios, Grupo 5227</w:t>
-      </w:r>
-    </w:p>
-    <w:p>
-      <w:pPr>
-        <w:pStyle w:val="Normal"/>
-        <w:spacing w:lineRule="auto" w:line="276" w:before="1400" w:after="0"/>
-        <w:jc w:val="center"/>
-        <w:rPr>
-          <w:rFonts w:ascii="Times New Roman" w:hAnsi="Times New Roman" w:eastAsia="Times New Roman"/>
-          <w:b/>
-          <w:sz w:val="36"/>
-        </w:rPr>
-      </w:pPr>
-      <w:r>
-        <w:rPr>
-          <w:rFonts w:eastAsia="Times New Roman"/>
-          <w:b/>
-          <w:sz w:val="36"/>
-        </w:rPr>
-        <w:t>Práctica 1</w:t>
-      </w:r>
-    </w:p>
-    <w:p>
-      <w:pPr>
-        <w:pStyle w:val="Normal"/>
-        <w:spacing w:lineRule="auto" w:line="276" w:before="120" w:after="0"/>
-        <w:jc w:val="center"/>
-        <w:rPr>
-          <w:rFonts w:ascii="Times New Roman" w:hAnsi="Times New Roman" w:eastAsia="Times New Roman"/>
-          <w:b/>
-          <w:sz w:val="30"/>
-        </w:rPr>
-      </w:pPr>
-      <w:r>
-        <w:rPr>
-          <w:rFonts w:eastAsia="Times New Roman"/>
-          <w:b/>
-          <w:sz w:val="30"/>
-        </w:rPr>
-        <w:t>Diseño e implementación de una solución de Inteligencia de Negocios</w:t>
-      </w:r>
-    </w:p>
-    <w:p>
-      <w:pPr>
-        <w:pStyle w:val="Normal"/>
-        <w:spacing w:lineRule="auto" w:line="276" w:before="1800" w:after="0"/>
-        <w:jc w:val="center"/>
-        <w:rPr>
-          <w:rFonts w:ascii="Times New Roman" w:hAnsi="Times New Roman" w:eastAsia="Times New Roman"/>
-          <w:b/>
-          <w:sz w:val="24"/>
-        </w:rPr>
-      </w:pPr>
-      <w:r>
-        <w:rPr>
-          <w:rFonts w:eastAsia="Times New Roman"/>
-          <w:b/>
-          <w:sz w:val="24"/>
-        </w:rPr>
-        <w:t>Presentado por:</w:t>
-      </w:r>
-    </w:p>
-    <w:p>
-      <w:pPr>
-        <w:pStyle w:val="Normal"/>
-        <w:spacing w:lineRule="auto" w:line="276" w:before="0" w:after="0"/>
-        <w:jc w:val="center"/>
-        <w:rPr>
-          <w:rFonts w:ascii="Times New Roman" w:hAnsi="Times New Roman" w:eastAsia="Times New Roman"/>
-          <w:b w:val="false"/>
-          <w:sz w:val="24"/>
-        </w:rPr>
-      </w:pPr>
-      <w:r>
-        <w:rPr>
-          <w:rFonts w:eastAsia="Times New Roman"/>
-          <w:b w:val="false"/>
-          <w:sz w:val="24"/>
-        </w:rPr>
-        <w:t>Elías De La Cruz Jiménez, 1015-5971</w:t>
-      </w:r>
-    </w:p>
-    <w:p>
-      <w:pPr>
-        <w:pStyle w:val="Normal"/>
-        <w:spacing w:lineRule="auto" w:line="276" w:before="0" w:after="0"/>
-        <w:jc w:val="center"/>
-        <w:rPr>
-          <w:rFonts w:ascii="Times New Roman" w:hAnsi="Times New Roman" w:eastAsia="Times New Roman"/>
-          <w:b w:val="false"/>
-          <w:sz w:val="24"/>
-        </w:rPr>
-      </w:pPr>
-      <w:r>
-        <w:rPr>
-          <w:rFonts w:eastAsia="Times New Roman"/>
-          <w:b w:val="false"/>
-          <w:sz w:val="24"/>
-        </w:rPr>
-        <w:t>Enger Douglas, 1014-4675</w:t>
-      </w:r>
-    </w:p>
-    <w:p>
-      <w:pPr>
-        <w:pStyle w:val="Normal"/>
-        <w:spacing w:lineRule="auto" w:line="276" w:before="480" w:after="0"/>
-        <w:jc w:val="center"/>
-        <w:rPr>
-          <w:rFonts w:ascii="Times New Roman" w:hAnsi="Times New Roman" w:eastAsia="Times New Roman"/>
-          <w:b/>
-          <w:sz w:val="24"/>
-        </w:rPr>
-      </w:pPr>
-      <w:r>
-        <w:rPr>
-          <w:rFonts w:eastAsia="Times New Roman"/>
-          <w:b/>
-          <w:sz w:val="24"/>
-        </w:rPr>
-        <w:t>Presentado a:</w:t>
-      </w:r>
-    </w:p>
-    <w:p>
-      <w:pPr>
-        <w:pStyle w:val="Normal"/>
-        <w:spacing w:lineRule="auto" w:line="276" w:before="0" w:after="0"/>
-        <w:jc w:val="center"/>
-        <w:rPr>
-          <w:rFonts w:ascii="Times New Roman" w:hAnsi="Times New Roman" w:eastAsia="Times New Roman"/>
-          <w:b w:val="false"/>
-          <w:sz w:val="24"/>
-        </w:rPr>
-      </w:pPr>
-      <w:r>
-        <w:rPr>
-          <w:rFonts w:eastAsia="Times New Roman"/>
-          <w:b w:val="false"/>
-          <w:sz w:val="24"/>
-        </w:rPr>
-        <w:t>Prof. Lisibonny Beato</w:t>
-      </w:r>
-    </w:p>
-    <w:p>
-      <w:pPr>
-        <w:pStyle w:val="Normal"/>
-        <w:spacing w:lineRule="auto" w:line="276" w:before="1600" w:after="0"/>
-        <w:jc w:val="center"/>
-        <w:rPr>
-          <w:rFonts w:ascii="Times New Roman" w:hAnsi="Times New Roman" w:eastAsia="Times New Roman"/>
-          <w:b w:val="false"/>
-          <w:sz w:val="24"/>
-        </w:rPr>
-      </w:pPr>
-      <w:r>
-        <w:rPr>
-          <w:rFonts w:eastAsia="Times New Roman"/>
-          <w:b w:val="false"/>
-          <w:sz w:val="24"/>
-        </w:rPr>
-        <w:t>Santiago de los Caballeros, República Dominicana</w:t>
-      </w:r>
-    </w:p>
-    <w:p>
-      <w:pPr>
-        <w:pStyle w:val="Normal"/>
-        <w:spacing w:lineRule="auto" w:line="276" w:before="0" w:after="0"/>
-        <w:jc w:val="center"/>
-        <w:rPr>
-          <w:rFonts w:ascii="Times New Roman" w:hAnsi="Times New Roman" w:eastAsia="Times New Roman"/>
-          <w:b w:val="false"/>
-          <w:sz w:val="24"/>
-        </w:rPr>
-      </w:pPr>
-      <w:r>
-        <w:rPr>
-          <w:rFonts w:eastAsia="Times New Roman"/>
-          <w:b w:val="false"/>
-          <w:sz w:val="24"/>
-        </w:rPr>
-        <w:t>27 de septiembre de 2026</w:t>
-      </w:r>
-    </w:p>
-    <w:p>
-      <w:pPr>
-        <w:pStyle w:val="Normal"/>
-        <w:rPr/>
-      </w:pPr>
-      <w:r>
-        <w:rPr/>
-      </w:r>
-      <w:r>
-        <w:br w:type="page"/>
-      </w:r>
-    </w:p>
-    <w:p>
-      <w:pPr>
-        <w:pStyle w:val="Normal"/>
-        <w:spacing w:lineRule="auto" w:line="276" w:before="0" w:after="240"/>
-        <w:jc w:val="center"/>
-        <w:rPr>
-          <w:rFonts w:ascii="Times New Roman" w:hAnsi="Times New Roman" w:eastAsia="Times New Roman"/>
-          <w:b/>
-          <w:sz w:val="28"/>
-        </w:rPr>
-      </w:pPr>
-      <w:r>
-        <w:rPr>
-          <w:rFonts w:eastAsia="Times New Roman"/>
-          <w:b/>
-          <w:sz w:val="28"/>
-        </w:rPr>
-        <w:t>Índice</w:t>
-      </w:r>
-    </w:p>
-    <w:p>
-      <w:pPr>
-        <w:pStyle w:val="Normal"/>
-        <w:tabs>
-          <w:tab w:val="clear" w:pos="720"/>
-          <w:tab w:val="right" w:pos="9360" w:leader="dot"/>
-        </w:tabs>
-        <w:spacing w:lineRule="auto" w:line="240" w:before="0" w:after="20"/>
-        <w:ind w:left="0"/>
-        <w:rPr>
-          <w:rFonts w:ascii="Times New Roman" w:hAnsi="Times New Roman" w:eastAsia="Times New Roman"/>
-          <w:b/>
-          <w:sz w:val="22"/>
-        </w:rPr>
-      </w:pPr>
-      <w:r>
-        <w:rPr>
-          <w:rFonts w:eastAsia="Times New Roman"/>
-          <w:b/>
-          <w:sz w:val="22"/>
-        </w:rPr>
-        <w:t>1. Introducción</w:t>
-        <w:tab/>
-        <w:t>3</w:t>
-      </w:r>
-    </w:p>
-    <w:p>
-      <w:pPr>
-        <w:pStyle w:val="Normal"/>
-        <w:tabs>
-          <w:tab w:val="clear" w:pos="720"/>
-          <w:tab w:val="right" w:pos="9360" w:leader="dot"/>
-        </w:tabs>
-        <w:spacing w:lineRule="auto" w:line="240" w:before="0" w:after="20"/>
-        <w:ind w:left="0"/>
-        <w:rPr>
-          <w:rFonts w:ascii="Times New Roman" w:hAnsi="Times New Roman" w:eastAsia="Times New Roman"/>
-          <w:b/>
-          <w:sz w:val="22"/>
-        </w:rPr>
-      </w:pPr>
-      <w:r>
-        <w:rPr>
-          <w:rFonts w:eastAsia="Times New Roman"/>
-          <w:b/>
-          <w:sz w:val="22"/>
-        </w:rPr>
-        <w:t>2. Descripción general de la fuente de datos</w:t>
-        <w:tab/>
-        <w:t>3</w:t>
-      </w:r>
-    </w:p>
-    <w:p>
-      <w:pPr>
-        <w:pStyle w:val="Normal"/>
-        <w:tabs>
-          <w:tab w:val="clear" w:pos="720"/>
-          <w:tab w:val="right" w:pos="9360" w:leader="dot"/>
-        </w:tabs>
-        <w:spacing w:lineRule="auto" w:line="240" w:before="0" w:after="20"/>
-        <w:ind w:left="454"/>
-        <w:rPr>
-          <w:rFonts w:ascii="Times New Roman" w:hAnsi="Times New Roman" w:eastAsia="Times New Roman"/>
-          <w:b w:val="false"/>
-          <w:sz w:val="22"/>
-        </w:rPr>
-      </w:pPr>
-      <w:r>
-        <w:rPr>
-          <w:rFonts w:eastAsia="Times New Roman"/>
-          <w:b w:val="false"/>
-          <w:sz w:val="22"/>
-        </w:rPr>
-        <w:t>2.1 Entidades y relaciones</w:t>
-        <w:tab/>
-        <w:t>4</w:t>
-      </w:r>
-    </w:p>
-    <w:p>
-      <w:pPr>
-        <w:pStyle w:val="Normal"/>
-        <w:tabs>
-          <w:tab w:val="clear" w:pos="720"/>
-          <w:tab w:val="right" w:pos="9360" w:leader="dot"/>
-        </w:tabs>
-        <w:spacing w:lineRule="auto" w:line="240" w:before="0" w:after="20"/>
-        <w:ind w:left="454"/>
-        <w:rPr>
-          <w:rFonts w:ascii="Times New Roman" w:hAnsi="Times New Roman" w:eastAsia="Times New Roman"/>
-          <w:b w:val="false"/>
-          <w:sz w:val="22"/>
-        </w:rPr>
-      </w:pPr>
-      <w:r>
-        <w:rPr>
-          <w:rFonts w:eastAsia="Times New Roman"/>
-          <w:b w:val="false"/>
-          <w:sz w:val="22"/>
-        </w:rPr>
-        <w:t>2.2 Naturaleza y granularidad de los datos</w:t>
-        <w:tab/>
-        <w:t>5</w:t>
-      </w:r>
-    </w:p>
-    <w:p>
-      <w:pPr>
-        <w:pStyle w:val="Normal"/>
-        <w:tabs>
-          <w:tab w:val="clear" w:pos="720"/>
-          <w:tab w:val="right" w:pos="9360" w:leader="dot"/>
-        </w:tabs>
-        <w:spacing w:lineRule="auto" w:line="240" w:before="0" w:after="20"/>
-        <w:ind w:left="454"/>
-        <w:rPr>
-          <w:rFonts w:ascii="Times New Roman" w:hAnsi="Times New Roman" w:eastAsia="Times New Roman"/>
-          <w:b w:val="false"/>
-          <w:sz w:val="22"/>
-        </w:rPr>
-      </w:pPr>
-      <w:r>
-        <w:rPr>
-          <w:rFonts w:eastAsia="Times New Roman"/>
-          <w:b w:val="false"/>
-          <w:sz w:val="22"/>
-        </w:rPr>
-        <w:t>2.3 Variables disponibles para el análisis</w:t>
-        <w:tab/>
-        <w:t>5</w:t>
-      </w:r>
-    </w:p>
-    <w:p>
-      <w:pPr>
-        <w:pStyle w:val="Normal"/>
-        <w:tabs>
-          <w:tab w:val="clear" w:pos="720"/>
-          <w:tab w:val="right" w:pos="9360" w:leader="dot"/>
-        </w:tabs>
-        <w:spacing w:lineRule="auto" w:line="240" w:before="0" w:after="20"/>
-        <w:ind w:left="454"/>
-        <w:rPr>
-          <w:rFonts w:ascii="Times New Roman" w:hAnsi="Times New Roman" w:eastAsia="Times New Roman"/>
-          <w:b w:val="false"/>
-          <w:sz w:val="22"/>
-        </w:rPr>
-      </w:pPr>
-      <w:r>
-        <w:rPr>
-          <w:rFonts w:eastAsia="Times New Roman"/>
-          <w:b w:val="false"/>
-          <w:sz w:val="22"/>
-        </w:rPr>
-        <w:t>2.4 Problemas de calidad de datos</w:t>
-        <w:tab/>
-        <w:t>6</w:t>
-      </w:r>
-    </w:p>
-    <w:p>
-      <w:pPr>
-        <w:pStyle w:val="Normal"/>
-        <w:tabs>
-          <w:tab w:val="clear" w:pos="720"/>
-          <w:tab w:val="right" w:pos="9360" w:leader="dot"/>
-        </w:tabs>
-        <w:spacing w:lineRule="auto" w:line="240" w:before="0" w:after="20"/>
-        <w:ind w:left="454"/>
-        <w:rPr>
-          <w:rFonts w:ascii="Times New Roman" w:hAnsi="Times New Roman" w:eastAsia="Times New Roman"/>
-          <w:b w:val="false"/>
-          <w:sz w:val="22"/>
-        </w:rPr>
-      </w:pPr>
-      <w:r>
-        <w:rPr>
-          <w:rFonts w:eastAsia="Times New Roman"/>
-          <w:b w:val="false"/>
-          <w:sz w:val="22"/>
-        </w:rPr>
-        <w:t>2.5 Posibilidades de análisis</w:t>
-        <w:tab/>
-        <w:t>6</w:t>
-      </w:r>
-    </w:p>
-    <w:p>
-      <w:pPr>
-        <w:pStyle w:val="Normal"/>
-        <w:tabs>
-          <w:tab w:val="clear" w:pos="720"/>
-          <w:tab w:val="right" w:pos="9360" w:leader="dot"/>
-        </w:tabs>
-        <w:spacing w:lineRule="auto" w:line="240" w:before="0" w:after="20"/>
-        <w:ind w:left="0"/>
-        <w:rPr>
-          <w:rFonts w:ascii="Times New Roman" w:hAnsi="Times New Roman" w:eastAsia="Times New Roman"/>
-          <w:b/>
-          <w:sz w:val="22"/>
-        </w:rPr>
-      </w:pPr>
-      <w:r>
-        <w:rPr>
-          <w:rFonts w:eastAsia="Times New Roman"/>
-          <w:b/>
-          <w:sz w:val="22"/>
-        </w:rPr>
-        <w:t>3. Problema de toma de decisiones</w:t>
-        <w:tab/>
-        <w:t>6</w:t>
-      </w:r>
-    </w:p>
-    <w:p>
-      <w:pPr>
-        <w:pStyle w:val="Normal"/>
-        <w:tabs>
-          <w:tab w:val="clear" w:pos="720"/>
-          <w:tab w:val="right" w:pos="9360" w:leader="dot"/>
-        </w:tabs>
-        <w:spacing w:lineRule="auto" w:line="240" w:before="0" w:after="20"/>
-        <w:ind w:left="454"/>
-        <w:rPr>
-          <w:rFonts w:ascii="Times New Roman" w:hAnsi="Times New Roman" w:eastAsia="Times New Roman"/>
-          <w:b w:val="false"/>
-          <w:sz w:val="22"/>
-        </w:rPr>
-      </w:pPr>
-      <w:r>
-        <w:rPr>
-          <w:rFonts w:eastAsia="Times New Roman"/>
-          <w:b w:val="false"/>
-          <w:sz w:val="22"/>
-        </w:rPr>
-        <w:t>3.1 Situación encontrada en los datos</w:t>
-        <w:tab/>
-        <w:t>6</w:t>
-      </w:r>
-    </w:p>
-    <w:p>
-      <w:pPr>
-        <w:pStyle w:val="Normal"/>
-        <w:tabs>
-          <w:tab w:val="clear" w:pos="720"/>
-          <w:tab w:val="right" w:pos="9360" w:leader="dot"/>
-        </w:tabs>
-        <w:spacing w:lineRule="auto" w:line="240" w:before="0" w:after="20"/>
-        <w:ind w:left="454"/>
-        <w:rPr>
-          <w:rFonts w:ascii="Times New Roman" w:hAnsi="Times New Roman" w:eastAsia="Times New Roman"/>
-          <w:b w:val="false"/>
-          <w:sz w:val="22"/>
-        </w:rPr>
-      </w:pPr>
-      <w:r>
-        <w:rPr>
-          <w:rFonts w:eastAsia="Times New Roman"/>
-          <w:b w:val="false"/>
-          <w:sz w:val="22"/>
-        </w:rPr>
-        <w:t>3.2 Problema y necesidad de información</w:t>
-        <w:tab/>
-        <w:t>7</w:t>
-      </w:r>
-    </w:p>
-    <w:p>
-      <w:pPr>
-        <w:pStyle w:val="Normal"/>
-        <w:tabs>
-          <w:tab w:val="clear" w:pos="720"/>
-          <w:tab w:val="right" w:pos="9360" w:leader="dot"/>
-        </w:tabs>
-        <w:spacing w:lineRule="auto" w:line="240" w:before="0" w:after="20"/>
-        <w:ind w:left="454"/>
-        <w:rPr>
-          <w:rFonts w:ascii="Times New Roman" w:hAnsi="Times New Roman" w:eastAsia="Times New Roman"/>
-          <w:b w:val="false"/>
-          <w:sz w:val="22"/>
-        </w:rPr>
-      </w:pPr>
-      <w:r>
-        <w:rPr>
-          <w:rFonts w:eastAsia="Times New Roman"/>
-          <w:b w:val="false"/>
-          <w:sz w:val="22"/>
-        </w:rPr>
-        <w:t>3.3 Usuarios de la solución</w:t>
-        <w:tab/>
-        <w:t>7</w:t>
-      </w:r>
-    </w:p>
-    <w:p>
-      <w:pPr>
-        <w:pStyle w:val="Normal"/>
-        <w:tabs>
-          <w:tab w:val="clear" w:pos="720"/>
-          <w:tab w:val="right" w:pos="9360" w:leader="dot"/>
-        </w:tabs>
-        <w:spacing w:lineRule="auto" w:line="240" w:before="0" w:after="20"/>
-        <w:ind w:left="454"/>
-        <w:rPr>
-          <w:rFonts w:ascii="Times New Roman" w:hAnsi="Times New Roman" w:eastAsia="Times New Roman"/>
-          <w:b w:val="false"/>
-          <w:sz w:val="22"/>
-        </w:rPr>
-      </w:pPr>
-      <w:r>
-        <w:rPr>
-          <w:rFonts w:eastAsia="Times New Roman"/>
-          <w:b w:val="false"/>
-          <w:sz w:val="22"/>
-        </w:rPr>
-        <w:t>3.4 Decisiones que se busca apoyar</w:t>
-        <w:tab/>
-        <w:t>7</w:t>
-      </w:r>
-    </w:p>
-    <w:p>
-      <w:pPr>
-        <w:pStyle w:val="Normal"/>
-        <w:tabs>
-          <w:tab w:val="clear" w:pos="720"/>
-          <w:tab w:val="right" w:pos="9360" w:leader="dot"/>
-        </w:tabs>
-        <w:spacing w:lineRule="auto" w:line="240" w:before="0" w:after="20"/>
-        <w:ind w:left="454"/>
-        <w:rPr>
-          <w:rFonts w:ascii="Times New Roman" w:hAnsi="Times New Roman" w:eastAsia="Times New Roman"/>
-          <w:b w:val="false"/>
-          <w:sz w:val="22"/>
-        </w:rPr>
-      </w:pPr>
-      <w:r>
-        <w:rPr>
-          <w:rFonts w:eastAsia="Times New Roman"/>
-          <w:b w:val="false"/>
-          <w:sz w:val="22"/>
-        </w:rPr>
-        <w:t>3.5 Preguntas de análisis</w:t>
-        <w:tab/>
-        <w:t>8</w:t>
-      </w:r>
-    </w:p>
-    <w:p>
-      <w:pPr>
-        <w:pStyle w:val="Normal"/>
-        <w:tabs>
-          <w:tab w:val="clear" w:pos="720"/>
-          <w:tab w:val="right" w:pos="9360" w:leader="dot"/>
-        </w:tabs>
-        <w:spacing w:lineRule="auto" w:line="240" w:before="0" w:after="20"/>
-        <w:ind w:left="0"/>
-        <w:rPr>
-          <w:rFonts w:ascii="Times New Roman" w:hAnsi="Times New Roman" w:eastAsia="Times New Roman"/>
-          <w:b/>
-          <w:sz w:val="22"/>
-        </w:rPr>
-      </w:pPr>
-      <w:r>
-        <w:rPr>
-          <w:rFonts w:eastAsia="Times New Roman"/>
-          <w:b/>
-          <w:sz w:val="22"/>
-        </w:rPr>
-        <w:t>4. Diseño del modelo dimensional</w:t>
-        <w:tab/>
-        <w:t>8</w:t>
-      </w:r>
-    </w:p>
-    <w:p>
-      <w:pPr>
-        <w:pStyle w:val="Normal"/>
-        <w:tabs>
-          <w:tab w:val="clear" w:pos="720"/>
-          <w:tab w:val="right" w:pos="9360" w:leader="dot"/>
-        </w:tabs>
-        <w:spacing w:lineRule="auto" w:line="240" w:before="0" w:after="20"/>
-        <w:ind w:left="454"/>
-        <w:rPr>
-          <w:rFonts w:ascii="Times New Roman" w:hAnsi="Times New Roman" w:eastAsia="Times New Roman"/>
-          <w:b w:val="false"/>
-          <w:sz w:val="22"/>
-        </w:rPr>
-      </w:pPr>
-      <w:r>
-        <w:rPr>
-          <w:rFonts w:eastAsia="Times New Roman"/>
-          <w:b w:val="false"/>
-          <w:sz w:val="22"/>
-        </w:rPr>
-        <w:t>4.1 Proceso de negocio y grano</w:t>
-        <w:tab/>
-        <w:t>8</w:t>
-      </w:r>
-    </w:p>
-    <w:p>
-      <w:pPr>
-        <w:pStyle w:val="Normal"/>
-        <w:tabs>
-          <w:tab w:val="clear" w:pos="720"/>
-          <w:tab w:val="right" w:pos="9360" w:leader="dot"/>
-        </w:tabs>
-        <w:spacing w:lineRule="auto" w:line="240" w:before="0" w:after="20"/>
-        <w:ind w:left="454"/>
-        <w:rPr>
-          <w:rFonts w:ascii="Times New Roman" w:hAnsi="Times New Roman" w:eastAsia="Times New Roman"/>
-          <w:b w:val="false"/>
-          <w:sz w:val="22"/>
-        </w:rPr>
-      </w:pPr>
-      <w:r>
-        <w:rPr>
-          <w:rFonts w:eastAsia="Times New Roman"/>
-          <w:b w:val="false"/>
-          <w:sz w:val="22"/>
-        </w:rPr>
-        <w:t>4.2 Medidas</w:t>
-        <w:tab/>
-        <w:t>8</w:t>
-      </w:r>
-    </w:p>
-    <w:p>
-      <w:pPr>
-        <w:pStyle w:val="Normal"/>
-        <w:tabs>
-          <w:tab w:val="clear" w:pos="720"/>
-          <w:tab w:val="right" w:pos="9360" w:leader="dot"/>
-        </w:tabs>
-        <w:spacing w:lineRule="auto" w:line="240" w:before="0" w:after="20"/>
-        <w:ind w:left="454"/>
-        <w:rPr>
-          <w:rFonts w:ascii="Times New Roman" w:hAnsi="Times New Roman" w:eastAsia="Times New Roman"/>
-          <w:b w:val="false"/>
-          <w:sz w:val="22"/>
-        </w:rPr>
-      </w:pPr>
-      <w:r>
-        <w:rPr>
-          <w:rFonts w:eastAsia="Times New Roman"/>
-          <w:b w:val="false"/>
-          <w:sz w:val="22"/>
-        </w:rPr>
-        <w:t>4.3 Dimensiones</w:t>
-        <w:tab/>
-        <w:t>9</w:t>
-      </w:r>
-    </w:p>
-    <w:p>
-      <w:pPr>
-        <w:pStyle w:val="Normal"/>
-        <w:tabs>
-          <w:tab w:val="clear" w:pos="720"/>
-          <w:tab w:val="right" w:pos="9360" w:leader="dot"/>
-        </w:tabs>
-        <w:spacing w:lineRule="auto" w:line="240" w:before="0" w:after="20"/>
-        <w:ind w:left="454"/>
-        <w:rPr>
-          <w:rFonts w:ascii="Times New Roman" w:hAnsi="Times New Roman" w:eastAsia="Times New Roman"/>
-          <w:b w:val="false"/>
-          <w:sz w:val="22"/>
-        </w:rPr>
-      </w:pPr>
-      <w:r>
-        <w:rPr>
-          <w:rFonts w:eastAsia="Times New Roman"/>
-          <w:b w:val="false"/>
-          <w:sz w:val="22"/>
-        </w:rPr>
-        <w:t>4.4 Esquema estrella</w:t>
-        <w:tab/>
-        <w:t>9</w:t>
-      </w:r>
-    </w:p>
-    <w:p>
-      <w:pPr>
-        <w:pStyle w:val="Normal"/>
-        <w:tabs>
-          <w:tab w:val="clear" w:pos="720"/>
-          <w:tab w:val="right" w:pos="9360" w:leader="dot"/>
-        </w:tabs>
-        <w:spacing w:lineRule="auto" w:line="240" w:before="0" w:after="20"/>
-        <w:ind w:left="454"/>
-        <w:rPr>
-          <w:rFonts w:ascii="Times New Roman" w:hAnsi="Times New Roman" w:eastAsia="Times New Roman"/>
-          <w:b w:val="false"/>
-          <w:sz w:val="22"/>
-        </w:rPr>
-      </w:pPr>
-      <w:r>
-        <w:rPr>
-          <w:rFonts w:eastAsia="Times New Roman"/>
-          <w:b w:val="false"/>
-          <w:sz w:val="22"/>
-        </w:rPr>
-        <w:t>4.5 Claves y relaciones</w:t>
-        <w:tab/>
-        <w:t>10</w:t>
-      </w:r>
-    </w:p>
-    <w:p>
-      <w:pPr>
-        <w:pStyle w:val="Normal"/>
-        <w:tabs>
-          <w:tab w:val="clear" w:pos="720"/>
-          <w:tab w:val="right" w:pos="9360" w:leader="dot"/>
-        </w:tabs>
-        <w:spacing w:lineRule="auto" w:line="240" w:before="0" w:after="20"/>
-        <w:ind w:left="454"/>
-        <w:rPr>
-          <w:rFonts w:ascii="Times New Roman" w:hAnsi="Times New Roman" w:eastAsia="Times New Roman"/>
-          <w:b w:val="false"/>
-          <w:sz w:val="22"/>
-        </w:rPr>
-      </w:pPr>
-      <w:r>
-        <w:rPr>
-          <w:rFonts w:eastAsia="Times New Roman"/>
-          <w:b w:val="false"/>
-          <w:sz w:val="22"/>
-        </w:rPr>
-        <w:t>4.6 Relación entre preguntas, medidas y dimensiones</w:t>
-        <w:tab/>
-        <w:t>11</w:t>
-      </w:r>
-    </w:p>
-    <w:p>
-      <w:pPr>
-        <w:pStyle w:val="Normal"/>
-        <w:tabs>
-          <w:tab w:val="clear" w:pos="720"/>
-          <w:tab w:val="right" w:pos="9360" w:leader="dot"/>
-        </w:tabs>
-        <w:spacing w:lineRule="auto" w:line="240" w:before="0" w:after="20"/>
-        <w:ind w:left="0"/>
-        <w:rPr>
-          <w:rFonts w:ascii="Times New Roman" w:hAnsi="Times New Roman" w:eastAsia="Times New Roman"/>
-          <w:b/>
-          <w:sz w:val="22"/>
-        </w:rPr>
-      </w:pPr>
-      <w:r>
-        <w:rPr>
-          <w:rFonts w:eastAsia="Times New Roman"/>
-          <w:b/>
-          <w:sz w:val="22"/>
-        </w:rPr>
-        <w:t>5. Implementación del Data Warehouse</w:t>
-        <w:tab/>
-        <w:t>11</w:t>
-      </w:r>
-    </w:p>
-    <w:p>
-      <w:pPr>
-        <w:pStyle w:val="Normal"/>
-        <w:tabs>
-          <w:tab w:val="clear" w:pos="720"/>
-          <w:tab w:val="right" w:pos="9360" w:leader="dot"/>
-        </w:tabs>
-        <w:spacing w:lineRule="auto" w:line="240" w:before="0" w:after="20"/>
-        <w:ind w:left="0"/>
-        <w:rPr>
-          <w:rFonts w:ascii="Times New Roman" w:hAnsi="Times New Roman" w:eastAsia="Times New Roman"/>
-          <w:b/>
-          <w:sz w:val="22"/>
-        </w:rPr>
-      </w:pPr>
-      <w:r>
-        <w:rPr>
-          <w:rFonts w:eastAsia="Times New Roman"/>
-          <w:b/>
-          <w:sz w:val="22"/>
-        </w:rPr>
-        <w:t>6. Proceso ETL en Tableau Prep</w:t>
-        <w:tab/>
-        <w:t>13</w:t>
-      </w:r>
-    </w:p>
-    <w:p>
-      <w:pPr>
-        <w:pStyle w:val="Normal"/>
-        <w:tabs>
-          <w:tab w:val="clear" w:pos="720"/>
-          <w:tab w:val="right" w:pos="9360" w:leader="dot"/>
-        </w:tabs>
-        <w:spacing w:lineRule="auto" w:line="240" w:before="0" w:after="20"/>
-        <w:ind w:left="0"/>
-        <w:rPr>
-          <w:rFonts w:ascii="Times New Roman" w:hAnsi="Times New Roman" w:eastAsia="Times New Roman"/>
-          <w:b/>
-          <w:sz w:val="22"/>
-        </w:rPr>
-      </w:pPr>
-      <w:r>
-        <w:rPr>
-          <w:rFonts w:eastAsia="Times New Roman"/>
-          <w:b/>
-          <w:sz w:val="22"/>
-        </w:rPr>
-        <w:t>7. Análisis de las medidas</w:t>
-        <w:tab/>
-        <w:t>15</w:t>
-      </w:r>
-    </w:p>
-    <w:p>
-      <w:pPr>
-        <w:pStyle w:val="Normal"/>
-        <w:tabs>
-          <w:tab w:val="clear" w:pos="720"/>
-          <w:tab w:val="right" w:pos="9360" w:leader="dot"/>
-        </w:tabs>
-        <w:spacing w:lineRule="auto" w:line="240" w:before="0" w:after="20"/>
-        <w:ind w:left="454"/>
-        <w:rPr>
-          <w:rFonts w:ascii="Times New Roman" w:hAnsi="Times New Roman" w:eastAsia="Times New Roman"/>
-          <w:b w:val="false"/>
-          <w:sz w:val="22"/>
-        </w:rPr>
-      </w:pPr>
-      <w:r>
-        <w:rPr>
-          <w:rFonts w:eastAsia="Times New Roman"/>
-          <w:b w:val="false"/>
-          <w:sz w:val="22"/>
-        </w:rPr>
-        <w:t>7.1 Medidas de FactVentas</w:t>
-        <w:tab/>
-        <w:t>15</w:t>
-      </w:r>
-    </w:p>
-    <w:p>
-      <w:pPr>
-        <w:pStyle w:val="Normal"/>
-        <w:tabs>
-          <w:tab w:val="clear" w:pos="720"/>
-          <w:tab w:val="right" w:pos="9360" w:leader="dot"/>
-        </w:tabs>
-        <w:spacing w:lineRule="auto" w:line="240" w:before="0" w:after="20"/>
-        <w:ind w:left="454"/>
-        <w:rPr>
-          <w:rFonts w:ascii="Times New Roman" w:hAnsi="Times New Roman" w:eastAsia="Times New Roman"/>
-          <w:b w:val="false"/>
-          <w:sz w:val="22"/>
-        </w:rPr>
-      </w:pPr>
-      <w:r>
-        <w:rPr>
-          <w:rFonts w:eastAsia="Times New Roman"/>
-          <w:b w:val="false"/>
-          <w:sz w:val="22"/>
-        </w:rPr>
-        <w:t>7.2 Medidas de FactDevoluciones</w:t>
-        <w:tab/>
-        <w:t>16</w:t>
-      </w:r>
-    </w:p>
-    <w:p>
-      <w:pPr>
-        <w:pStyle w:val="Normal"/>
-        <w:tabs>
-          <w:tab w:val="clear" w:pos="720"/>
-          <w:tab w:val="right" w:pos="9360" w:leader="dot"/>
-        </w:tabs>
-        <w:spacing w:lineRule="auto" w:line="240" w:before="0" w:after="20"/>
-        <w:ind w:left="454"/>
-        <w:rPr>
-          <w:rFonts w:ascii="Times New Roman" w:hAnsi="Times New Roman" w:eastAsia="Times New Roman"/>
-          <w:b w:val="false"/>
-          <w:sz w:val="22"/>
-        </w:rPr>
-      </w:pPr>
-      <w:r>
-        <w:rPr>
-          <w:rFonts w:eastAsia="Times New Roman"/>
-          <w:b w:val="false"/>
-          <w:sz w:val="22"/>
-        </w:rPr>
-        <w:t>7.3 Medida de FactPagos</w:t>
-        <w:tab/>
-        <w:t>17</w:t>
-      </w:r>
-    </w:p>
-    <w:p>
-      <w:pPr>
-        <w:pStyle w:val="Normal"/>
-        <w:tabs>
-          <w:tab w:val="clear" w:pos="720"/>
-          <w:tab w:val="right" w:pos="9360" w:leader="dot"/>
-        </w:tabs>
-        <w:spacing w:lineRule="auto" w:line="240" w:before="0" w:after="20"/>
-        <w:ind w:left="454"/>
-        <w:rPr>
-          <w:rFonts w:ascii="Times New Roman" w:hAnsi="Times New Roman" w:eastAsia="Times New Roman"/>
-          <w:b w:val="false"/>
-          <w:sz w:val="22"/>
-        </w:rPr>
-      </w:pPr>
-      <w:r>
-        <w:rPr>
-          <w:rFonts w:eastAsia="Times New Roman"/>
-          <w:b w:val="false"/>
-          <w:sz w:val="22"/>
-        </w:rPr>
-        <w:t>7.4 Indicadores calculados en el dashboard</w:t>
-        <w:tab/>
-        <w:t>17</w:t>
-      </w:r>
-    </w:p>
-    <w:p>
-      <w:pPr>
-        <w:pStyle w:val="Normal"/>
-        <w:tabs>
-          <w:tab w:val="clear" w:pos="720"/>
-          <w:tab w:val="right" w:pos="9360" w:leader="dot"/>
-        </w:tabs>
-        <w:spacing w:lineRule="auto" w:line="240" w:before="0" w:after="20"/>
-        <w:ind w:left="0"/>
-        <w:rPr>
-          <w:rFonts w:ascii="Times New Roman" w:hAnsi="Times New Roman" w:eastAsia="Times New Roman"/>
-          <w:b/>
-          <w:sz w:val="22"/>
-        </w:rPr>
-      </w:pPr>
-      <w:r>
-        <w:rPr>
-          <w:rFonts w:eastAsia="Times New Roman"/>
-          <w:b/>
-          <w:sz w:val="22"/>
-        </w:rPr>
-        <w:t>8. Dashboard interactivo</w:t>
-        <w:tab/>
-        <w:t>17</w:t>
-      </w:r>
-    </w:p>
-    <w:p>
-      <w:pPr>
-        <w:pStyle w:val="Normal"/>
-        <w:tabs>
-          <w:tab w:val="clear" w:pos="720"/>
-          <w:tab w:val="right" w:pos="9360" w:leader="dot"/>
-        </w:tabs>
-        <w:spacing w:lineRule="auto" w:line="240" w:before="0" w:after="20"/>
-        <w:ind w:left="454"/>
-        <w:rPr>
-          <w:rFonts w:ascii="Times New Roman" w:hAnsi="Times New Roman" w:eastAsia="Times New Roman"/>
-          <w:b w:val="false"/>
-          <w:sz w:val="22"/>
-        </w:rPr>
-      </w:pPr>
-      <w:r>
-        <w:rPr>
-          <w:rFonts w:eastAsia="Times New Roman"/>
-          <w:b w:val="false"/>
-          <w:sz w:val="22"/>
-        </w:rPr>
-        <w:t>8.1 Tablero 1: rentabilidad de la venta</w:t>
-        <w:tab/>
-        <w:t>18</w:t>
-      </w:r>
-    </w:p>
-    <w:p>
-      <w:pPr>
-        <w:pStyle w:val="Normal"/>
-        <w:tabs>
-          <w:tab w:val="clear" w:pos="720"/>
-          <w:tab w:val="right" w:pos="9360" w:leader="dot"/>
-        </w:tabs>
-        <w:spacing w:lineRule="auto" w:line="240" w:before="0" w:after="20"/>
-        <w:ind w:left="454"/>
-        <w:rPr>
-          <w:rFonts w:ascii="Times New Roman" w:hAnsi="Times New Roman" w:eastAsia="Times New Roman"/>
-          <w:b w:val="false"/>
-          <w:sz w:val="22"/>
-        </w:rPr>
-      </w:pPr>
-      <w:r>
-        <w:rPr>
-          <w:rFonts w:eastAsia="Times New Roman"/>
-          <w:b w:val="false"/>
-          <w:sz w:val="22"/>
-        </w:rPr>
-        <w:t>8.2 Tablero 2: devoluciones y proveedores</w:t>
-        <w:tab/>
-        <w:t>19</w:t>
-      </w:r>
-    </w:p>
-    <w:p>
-      <w:pPr>
-        <w:pStyle w:val="Normal"/>
-        <w:tabs>
-          <w:tab w:val="clear" w:pos="720"/>
-          <w:tab w:val="right" w:pos="9360" w:leader="dot"/>
-        </w:tabs>
-        <w:spacing w:lineRule="auto" w:line="240" w:before="0" w:after="20"/>
-        <w:ind w:left="454"/>
-        <w:rPr>
-          <w:rFonts w:ascii="Times New Roman" w:hAnsi="Times New Roman" w:eastAsia="Times New Roman"/>
-          <w:b w:val="false"/>
-          <w:sz w:val="22"/>
-        </w:rPr>
-      </w:pPr>
-      <w:r>
-        <w:rPr>
-          <w:rFonts w:eastAsia="Times New Roman"/>
-          <w:b w:val="false"/>
-          <w:sz w:val="22"/>
-        </w:rPr>
-        <w:t>8.3 Relación entre las preguntas y el dashboard</w:t>
-        <w:tab/>
-        <w:t>21</w:t>
-      </w:r>
-    </w:p>
-    <w:p>
-      <w:pPr>
-        <w:pStyle w:val="Normal"/>
-        <w:tabs>
-          <w:tab w:val="clear" w:pos="720"/>
-          <w:tab w:val="right" w:pos="9360" w:leader="dot"/>
-        </w:tabs>
-        <w:spacing w:lineRule="auto" w:line="240" w:before="0" w:after="20"/>
-        <w:ind w:left="0"/>
-        <w:rPr>
-          <w:rFonts w:ascii="Times New Roman" w:hAnsi="Times New Roman" w:eastAsia="Times New Roman"/>
-          <w:b/>
-          <w:sz w:val="22"/>
-        </w:rPr>
-      </w:pPr>
-      <w:r>
-        <w:rPr>
-          <w:rFonts w:eastAsia="Times New Roman"/>
-          <w:b/>
-          <w:sz w:val="22"/>
-        </w:rPr>
-        <w:t>9. Justificación de las principales decisiones de diseño</w:t>
-        <w:tab/>
-        <w:t>21</w:t>
-      </w:r>
-    </w:p>
-    <w:p>
-      <w:pPr>
-        <w:pStyle w:val="Normal"/>
-        <w:tabs>
-          <w:tab w:val="clear" w:pos="720"/>
-          <w:tab w:val="right" w:pos="9360" w:leader="dot"/>
-        </w:tabs>
-        <w:spacing w:lineRule="auto" w:line="240" w:before="0" w:after="20"/>
-        <w:ind w:left="0"/>
-        <w:rPr>
-          <w:rFonts w:ascii="Times New Roman" w:hAnsi="Times New Roman" w:eastAsia="Times New Roman"/>
-          <w:b/>
-          <w:sz w:val="22"/>
-        </w:rPr>
-      </w:pPr>
-      <w:r>
-        <w:rPr>
-          <w:rFonts w:eastAsia="Times New Roman"/>
-          <w:b/>
-          <w:sz w:val="22"/>
-        </w:rPr>
-        <w:t>10. Conclusiones</w:t>
-        <w:tab/>
-        <w:t>22</w:t>
-      </w:r>
-    </w:p>
-    <w:p>
-      <w:pPr>
-        <w:pStyle w:val="Normal"/>
-        <w:tabs>
-          <w:tab w:val="clear" w:pos="720"/>
-          <w:tab w:val="right" w:pos="9360" w:leader="dot"/>
-        </w:tabs>
-        <w:spacing w:lineRule="auto" w:line="240" w:before="0" w:after="20"/>
-        <w:ind w:left="0"/>
-        <w:rPr>
-          <w:rFonts w:ascii="Times New Roman" w:hAnsi="Times New Roman" w:eastAsia="Times New Roman"/>
-          <w:b/>
-          <w:sz w:val="22"/>
-        </w:rPr>
-      </w:pPr>
-      <w:r>
-        <w:rPr>
-          <w:rFonts w:eastAsia="Times New Roman"/>
-          <w:b/>
-          <w:sz w:val="22"/>
-        </w:rPr>
-        <w:t>Referencias</w:t>
-        <w:tab/>
-        <w:t>22</w:t>
-      </w:r>
-    </w:p>
-    <w:p>
-      <w:pPr>
-        <w:pStyle w:val="Normal"/>
-        <w:rPr/>
-      </w:pPr>
-      <w:r>
-        <w:rPr/>
-      </w:r>
-      <w:r>
-        <w:br w:type="page"/>
-      </w:r>
-    </w:p>
-    <w:p>
-      <w:pPr>
-        <w:pStyle w:val="Heading1"/>
-        <w:spacing w:before="0" w:after="120"/>
-        <w:rPr/>
-      </w:pPr>
-      <w:r>
-        <w:rPr/>
-        <w:t>1. Introducción</w:t>
-      </w:r>
-    </w:p>
-    <w:p>
-      <w:pPr>
-        <w:pStyle w:val="Normal"/>
-        <w:jc w:val="both"/>
-        <w:rPr>
-          <w:rFonts w:ascii="Times New Roman" w:hAnsi="Times New Roman" w:eastAsia="Times New Roman"/>
-          <w:sz w:val="24"/>
-        </w:rPr>
-      </w:pPr>
-      <w:r>
-        <w:rPr>
-          <w:rFonts w:eastAsia="Times New Roman"/>
-          <w:sz w:val="24"/>
-        </w:rPr>
-        <w:t>En esta práctica diseñamos e implementamos una solución de Inteligencia de Negocios completa a partir de la base de datos operacional BI_Practica_Retail, que se crea con el script entregado junto al enunciado. La base registra las ventas de una cadena de tiendas al detalle que vende en 12 sucursales físicas y por dos canales digitales (Web y App), entre el 1 de enero de 2023 y el 15 de agosto de 2026.</w:t>
-      </w:r>
-    </w:p>
-    <w:p>
-      <w:pPr>
-        <w:pStyle w:val="Normal"/>
-        <w:jc w:val="both"/>
-        <w:rPr>
-          <w:rFonts w:ascii="Times New Roman" w:hAnsi="Times New Roman" w:eastAsia="Times New Roman"/>
-          <w:sz w:val="24"/>
-        </w:rPr>
-      </w:pPr>
-      <w:r>
-        <w:rPr>
-          <w:rFonts w:eastAsia="Times New Roman"/>
-          <w:sz w:val="24"/>
-        </w:rPr>
-        <w:t>El trabajo siguió el orden que plantea el enunciado. Primero exploramos la fuente para entender sus tablas, su granularidad y sus problemas de calidad. Con eso definimos un problema de decisión y las preguntas de análisis que debía responder la solución. Luego diseñamos un modelo dimensional con la metodología de Kimball [1], lo implementamos como Data Warehouse en SQL Server, construimos el proceso ETL en Tableau Prep y, por último, desarrollamos un dashboard interactivo en Tableau Desktop que lee únicamente del Data Warehouse. Es el recorrido habitual de una solución de BI, que va de la integración de los datos a su análisis [2]. La Figura 1 lo resume.</w:t>
-      </w:r>
-    </w:p>
-    <w:p>
-      <w:pPr>
-        <w:pStyle w:val="Normal"/>
-        <w:keepNext w:val="true"/>
-        <w:spacing w:lineRule="auto" w:line="240"/>
+        <w:spacing w:before="0" w:after="360"/>
         <w:jc w:val="center"/>
         <w:rPr/>
       </w:pPr>
@@ -1247,7 +13,7 @@
         <w:rPr/>
         <w:drawing>
           <wp:inline distT="0" distB="0" distL="0" distR="0">
-            <wp:extent cx="5760085" cy="660400"/>
+            <wp:extent cx="3959860" cy="1315720"/>
             <wp:effectExtent l="0" t="0" r="0" b="0"/>
             <wp:docPr id="1" name="Picture 1"/>
             <wp:cNvGraphicFramePr>
@@ -1264,6 +30,1269 @@
                   </pic:nvPicPr>
                   <pic:blipFill>
                     <a:blip r:embed="rId2"/>
+                    <a:stretch>
+                      <a:fillRect/>
+                    </a:stretch>
+                  </pic:blipFill>
+                  <pic:spPr bwMode="auto">
+                    <a:xfrm>
+                      <a:off x="0" y="0"/>
+                      <a:ext cx="3959860" cy="1315720"/>
+                    </a:xfrm>
+                    <a:prstGeom prst="rect">
+                      <a:avLst/>
+                    </a:prstGeom>
+                    <a:noFill/>
+                  </pic:spPr>
+                </pic:pic>
+              </a:graphicData>
+            </a:graphic>
+          </wp:inline>
+        </w:drawing>
+      </w:r>
+    </w:p>
+    <w:p>
+      <w:pPr>
+        <w:pStyle w:val="Normal"/>
+        <w:spacing w:lineRule="auto" w:line="276" w:before="0" w:after="0"/>
+        <w:jc w:val="center"/>
+        <w:rPr>
+          <w:rFonts w:ascii="Times New Roman" w:hAnsi="Times New Roman" w:eastAsia="Times New Roman"/>
+          <w:b w:val="false"/>
+          <w:sz w:val="24"/>
+        </w:rPr>
+      </w:pPr>
+      <w:r>
+        <w:rPr>
+          <w:rFonts w:eastAsia="Times New Roman"/>
+          <w:b w:val="false"/>
+          <w:sz w:val="24"/>
+        </w:rPr>
+        <w:t>Facultad de Ciencias e Ingeniería</w:t>
+      </w:r>
+    </w:p>
+    <w:p>
+      <w:pPr>
+        <w:pStyle w:val="Normal"/>
+        <w:spacing w:lineRule="auto" w:line="276" w:before="0" w:after="0"/>
+        <w:jc w:val="center"/>
+        <w:rPr>
+          <w:rFonts w:ascii="Times New Roman" w:hAnsi="Times New Roman" w:eastAsia="Times New Roman"/>
+          <w:b w:val="false"/>
+          <w:sz w:val="24"/>
+        </w:rPr>
+      </w:pPr>
+      <w:r>
+        <w:rPr>
+          <w:rFonts w:eastAsia="Times New Roman"/>
+          <w:b w:val="false"/>
+          <w:sz w:val="24"/>
+        </w:rPr>
+        <w:t>Escuela de Ingeniería en Computación y Telecomunicaciones</w:t>
+      </w:r>
+    </w:p>
+    <w:p>
+      <w:pPr>
+        <w:pStyle w:val="Normal"/>
+        <w:spacing w:lineRule="auto" w:line="276" w:before="600" w:after="0"/>
+        <w:jc w:val="center"/>
+        <w:rPr>
+          <w:rFonts w:ascii="Times New Roman" w:hAnsi="Times New Roman" w:eastAsia="Times New Roman"/>
+          <w:b w:val="false"/>
+          <w:sz w:val="24"/>
+        </w:rPr>
+      </w:pPr>
+      <w:r>
+        <w:rPr>
+          <w:rFonts w:eastAsia="Times New Roman"/>
+          <w:b w:val="false"/>
+          <w:sz w:val="24"/>
+        </w:rPr>
+        <w:t>ICC-321-T Inteligencia de Negocios, Grupo 5227</w:t>
+      </w:r>
+    </w:p>
+    <w:p>
+      <w:pPr>
+        <w:pStyle w:val="Normal"/>
+        <w:spacing w:lineRule="auto" w:line="276" w:before="1100" w:after="0"/>
+        <w:jc w:val="center"/>
+        <w:rPr>
+          <w:rFonts w:ascii="Times New Roman" w:hAnsi="Times New Roman" w:eastAsia="Times New Roman"/>
+          <w:b/>
+          <w:sz w:val="36"/>
+        </w:rPr>
+      </w:pPr>
+      <w:r>
+        <w:rPr>
+          <w:rFonts w:eastAsia="Times New Roman"/>
+          <w:b/>
+          <w:sz w:val="36"/>
+        </w:rPr>
+        <w:t>Práctica 1</w:t>
+      </w:r>
+    </w:p>
+    <w:p>
+      <w:pPr>
+        <w:pStyle w:val="Normal"/>
+        <w:spacing w:lineRule="auto" w:line="276" w:before="120" w:after="0"/>
+        <w:jc w:val="center"/>
+        <w:rPr>
+          <w:rFonts w:ascii="Times New Roman" w:hAnsi="Times New Roman" w:eastAsia="Times New Roman"/>
+          <w:b/>
+          <w:sz w:val="30"/>
+        </w:rPr>
+      </w:pPr>
+      <w:r>
+        <w:rPr>
+          <w:rFonts w:eastAsia="Times New Roman"/>
+          <w:b/>
+          <w:sz w:val="30"/>
+        </w:rPr>
+        <w:t>Diseño e implementación de una solución de Inteligencia de Negocios</w:t>
+      </w:r>
+    </w:p>
+    <w:p>
+      <w:pPr>
+        <w:pStyle w:val="Normal"/>
+        <w:spacing w:lineRule="auto" w:line="276" w:before="1400" w:after="0"/>
+        <w:jc w:val="center"/>
+        <w:rPr>
+          <w:rFonts w:ascii="Times New Roman" w:hAnsi="Times New Roman" w:eastAsia="Times New Roman"/>
+          <w:b/>
+          <w:sz w:val="24"/>
+        </w:rPr>
+      </w:pPr>
+      <w:r>
+        <w:rPr>
+          <w:rFonts w:eastAsia="Times New Roman"/>
+          <w:b/>
+          <w:sz w:val="24"/>
+        </w:rPr>
+        <w:t>Presentado por:</w:t>
+      </w:r>
+    </w:p>
+    <w:p>
+      <w:pPr>
+        <w:pStyle w:val="Normal"/>
+        <w:spacing w:lineRule="auto" w:line="276" w:before="0" w:after="0"/>
+        <w:jc w:val="center"/>
+        <w:rPr>
+          <w:rFonts w:ascii="Times New Roman" w:hAnsi="Times New Roman" w:eastAsia="Times New Roman"/>
+          <w:b w:val="false"/>
+          <w:sz w:val="24"/>
+        </w:rPr>
+      </w:pPr>
+      <w:r>
+        <w:rPr>
+          <w:rFonts w:eastAsia="Times New Roman"/>
+          <w:b w:val="false"/>
+          <w:sz w:val="24"/>
+        </w:rPr>
+        <w:t>Elías De La Cruz Jiménez, 1015-5971</w:t>
+      </w:r>
+    </w:p>
+    <w:p>
+      <w:pPr>
+        <w:pStyle w:val="Normal"/>
+        <w:spacing w:lineRule="auto" w:line="276" w:before="0" w:after="0"/>
+        <w:jc w:val="center"/>
+        <w:rPr>
+          <w:rFonts w:ascii="Times New Roman" w:hAnsi="Times New Roman" w:eastAsia="Times New Roman"/>
+          <w:b w:val="false"/>
+          <w:sz w:val="24"/>
+        </w:rPr>
+      </w:pPr>
+      <w:r>
+        <w:rPr>
+          <w:rFonts w:eastAsia="Times New Roman"/>
+          <w:b w:val="false"/>
+          <w:sz w:val="24"/>
+        </w:rPr>
+        <w:t>Enger Douglas, 1014-4675</w:t>
+      </w:r>
+    </w:p>
+    <w:p>
+      <w:pPr>
+        <w:pStyle w:val="Normal"/>
+        <w:spacing w:lineRule="auto" w:line="276" w:before="480" w:after="0"/>
+        <w:jc w:val="center"/>
+        <w:rPr>
+          <w:rFonts w:ascii="Times New Roman" w:hAnsi="Times New Roman" w:eastAsia="Times New Roman"/>
+          <w:b/>
+          <w:sz w:val="24"/>
+        </w:rPr>
+      </w:pPr>
+      <w:r>
+        <w:rPr>
+          <w:rFonts w:eastAsia="Times New Roman"/>
+          <w:b/>
+          <w:sz w:val="24"/>
+        </w:rPr>
+        <w:t>Presentado a:</w:t>
+      </w:r>
+    </w:p>
+    <w:p>
+      <w:pPr>
+        <w:pStyle w:val="Normal"/>
+        <w:spacing w:lineRule="auto" w:line="276" w:before="0" w:after="0"/>
+        <w:jc w:val="center"/>
+        <w:rPr>
+          <w:rFonts w:ascii="Times New Roman" w:hAnsi="Times New Roman" w:eastAsia="Times New Roman"/>
+          <w:b w:val="false"/>
+          <w:sz w:val="24"/>
+        </w:rPr>
+      </w:pPr>
+      <w:r>
+        <w:rPr>
+          <w:rFonts w:eastAsia="Times New Roman"/>
+          <w:b w:val="false"/>
+          <w:sz w:val="24"/>
+        </w:rPr>
+        <w:t>Prof. Lisibonny Beato</w:t>
+      </w:r>
+    </w:p>
+    <w:p>
+      <w:pPr>
+        <w:pStyle w:val="Normal"/>
+        <w:spacing w:lineRule="auto" w:line="276" w:before="1200" w:after="0"/>
+        <w:jc w:val="center"/>
+        <w:rPr>
+          <w:rFonts w:ascii="Times New Roman" w:hAnsi="Times New Roman" w:eastAsia="Times New Roman"/>
+          <w:b w:val="false"/>
+          <w:sz w:val="24"/>
+        </w:rPr>
+      </w:pPr>
+      <w:r>
+        <w:rPr>
+          <w:rFonts w:eastAsia="Times New Roman"/>
+          <w:b w:val="false"/>
+          <w:sz w:val="24"/>
+        </w:rPr>
+        <w:t>Santiago de los Caballeros, República Dominicana</w:t>
+      </w:r>
+    </w:p>
+    <w:p>
+      <w:pPr>
+        <w:pStyle w:val="Normal"/>
+        <w:spacing w:lineRule="auto" w:line="276" w:before="0" w:after="0"/>
+        <w:jc w:val="center"/>
+        <w:rPr>
+          <w:rFonts w:ascii="Times New Roman" w:hAnsi="Times New Roman" w:eastAsia="Times New Roman"/>
+          <w:b w:val="false"/>
+          <w:sz w:val="24"/>
+        </w:rPr>
+      </w:pPr>
+      <w:r>
+        <w:rPr>
+          <w:rFonts w:eastAsia="Times New Roman"/>
+          <w:b w:val="false"/>
+          <w:sz w:val="24"/>
+        </w:rPr>
+        <w:t>27 de septiembre de 2026</w:t>
+      </w:r>
+    </w:p>
+    <w:p>
+      <w:pPr>
+        <w:pStyle w:val="Normal"/>
+        <w:rPr/>
+      </w:pPr>
+      <w:r>
+        <w:rPr/>
+      </w:r>
+      <w:r>
+        <w:br w:type="page"/>
+      </w:r>
+    </w:p>
+    <w:p>
+      <w:pPr>
+        <w:pStyle w:val="Normal"/>
+        <w:spacing w:lineRule="auto" w:line="276" w:before="0" w:after="240"/>
+        <w:jc w:val="center"/>
+        <w:rPr>
+          <w:rFonts w:ascii="Times New Roman" w:hAnsi="Times New Roman" w:eastAsia="Times New Roman"/>
+          <w:b/>
+          <w:sz w:val="28"/>
+        </w:rPr>
+      </w:pPr>
+      <w:r>
+        <w:rPr>
+          <w:rFonts w:eastAsia="Times New Roman"/>
+          <w:b/>
+          <w:sz w:val="28"/>
+        </w:rPr>
+        <w:t>Índice</w:t>
+      </w:r>
+    </w:p>
+    <w:p>
+      <w:pPr>
+        <w:pStyle w:val="Normal"/>
+        <w:tabs>
+          <w:tab w:val="clear" w:pos="720"/>
+          <w:tab w:val="right" w:pos="9360" w:leader="dot"/>
+        </w:tabs>
+        <w:spacing w:lineRule="auto" w:line="240" w:before="0" w:after="20"/>
+        <w:ind w:left="0"/>
+        <w:rPr>
+          <w:rFonts w:ascii="Times New Roman" w:hAnsi="Times New Roman" w:eastAsia="Times New Roman"/>
+          <w:b/>
+          <w:sz w:val="22"/>
+        </w:rPr>
+      </w:pPr>
+      <w:r>
+        <w:rPr>
+          <w:rFonts w:eastAsia="Times New Roman"/>
+          <w:b/>
+          <w:sz w:val="22"/>
+        </w:rPr>
+        <w:t>1. Introducción</w:t>
+        <w:tab/>
+        <w:t>3</w:t>
+      </w:r>
+    </w:p>
+    <w:p>
+      <w:pPr>
+        <w:pStyle w:val="Normal"/>
+        <w:tabs>
+          <w:tab w:val="clear" w:pos="720"/>
+          <w:tab w:val="right" w:pos="9360" w:leader="dot"/>
+        </w:tabs>
+        <w:spacing w:lineRule="auto" w:line="240" w:before="0" w:after="20"/>
+        <w:ind w:left="0"/>
+        <w:rPr>
+          <w:rFonts w:ascii="Times New Roman" w:hAnsi="Times New Roman" w:eastAsia="Times New Roman"/>
+          <w:b/>
+          <w:sz w:val="22"/>
+        </w:rPr>
+      </w:pPr>
+      <w:r>
+        <w:rPr>
+          <w:rFonts w:eastAsia="Times New Roman"/>
+          <w:b/>
+          <w:sz w:val="22"/>
+        </w:rPr>
+        <w:t>2. Descripción general de la fuente de datos</w:t>
+        <w:tab/>
+        <w:t>3</w:t>
+      </w:r>
+    </w:p>
+    <w:p>
+      <w:pPr>
+        <w:pStyle w:val="Normal"/>
+        <w:tabs>
+          <w:tab w:val="clear" w:pos="720"/>
+          <w:tab w:val="right" w:pos="9360" w:leader="dot"/>
+        </w:tabs>
+        <w:spacing w:lineRule="auto" w:line="240" w:before="0" w:after="20"/>
+        <w:ind w:left="454"/>
+        <w:rPr>
+          <w:rFonts w:ascii="Times New Roman" w:hAnsi="Times New Roman" w:eastAsia="Times New Roman"/>
+          <w:b w:val="false"/>
+          <w:sz w:val="22"/>
+        </w:rPr>
+      </w:pPr>
+      <w:r>
+        <w:rPr>
+          <w:rFonts w:eastAsia="Times New Roman"/>
+          <w:b w:val="false"/>
+          <w:sz w:val="22"/>
+        </w:rPr>
+        <w:t>2.1 Entidades y relaciones</w:t>
+        <w:tab/>
+        <w:t>4</w:t>
+      </w:r>
+    </w:p>
+    <w:p>
+      <w:pPr>
+        <w:pStyle w:val="Normal"/>
+        <w:tabs>
+          <w:tab w:val="clear" w:pos="720"/>
+          <w:tab w:val="right" w:pos="9360" w:leader="dot"/>
+        </w:tabs>
+        <w:spacing w:lineRule="auto" w:line="240" w:before="0" w:after="20"/>
+        <w:ind w:left="454"/>
+        <w:rPr>
+          <w:rFonts w:ascii="Times New Roman" w:hAnsi="Times New Roman" w:eastAsia="Times New Roman"/>
+          <w:b w:val="false"/>
+          <w:sz w:val="22"/>
+        </w:rPr>
+      </w:pPr>
+      <w:r>
+        <w:rPr>
+          <w:rFonts w:eastAsia="Times New Roman"/>
+          <w:b w:val="false"/>
+          <w:sz w:val="22"/>
+        </w:rPr>
+        <w:t>2.2 Naturaleza y granularidad de los datos</w:t>
+        <w:tab/>
+        <w:t>5</w:t>
+      </w:r>
+    </w:p>
+    <w:p>
+      <w:pPr>
+        <w:pStyle w:val="Normal"/>
+        <w:tabs>
+          <w:tab w:val="clear" w:pos="720"/>
+          <w:tab w:val="right" w:pos="9360" w:leader="dot"/>
+        </w:tabs>
+        <w:spacing w:lineRule="auto" w:line="240" w:before="0" w:after="20"/>
+        <w:ind w:left="454"/>
+        <w:rPr>
+          <w:rFonts w:ascii="Times New Roman" w:hAnsi="Times New Roman" w:eastAsia="Times New Roman"/>
+          <w:b w:val="false"/>
+          <w:sz w:val="22"/>
+        </w:rPr>
+      </w:pPr>
+      <w:r>
+        <w:rPr>
+          <w:rFonts w:eastAsia="Times New Roman"/>
+          <w:b w:val="false"/>
+          <w:sz w:val="22"/>
+        </w:rPr>
+        <w:t>2.3 Variables disponibles para el análisis</w:t>
+        <w:tab/>
+        <w:t>5</w:t>
+      </w:r>
+    </w:p>
+    <w:p>
+      <w:pPr>
+        <w:pStyle w:val="Normal"/>
+        <w:tabs>
+          <w:tab w:val="clear" w:pos="720"/>
+          <w:tab w:val="right" w:pos="9360" w:leader="dot"/>
+        </w:tabs>
+        <w:spacing w:lineRule="auto" w:line="240" w:before="0" w:after="20"/>
+        <w:ind w:left="454"/>
+        <w:rPr>
+          <w:rFonts w:ascii="Times New Roman" w:hAnsi="Times New Roman" w:eastAsia="Times New Roman"/>
+          <w:b w:val="false"/>
+          <w:sz w:val="22"/>
+        </w:rPr>
+      </w:pPr>
+      <w:r>
+        <w:rPr>
+          <w:rFonts w:eastAsia="Times New Roman"/>
+          <w:b w:val="false"/>
+          <w:sz w:val="22"/>
+        </w:rPr>
+        <w:t>2.4 Problemas de calidad de datos</w:t>
+        <w:tab/>
+        <w:t>6</w:t>
+      </w:r>
+    </w:p>
+    <w:p>
+      <w:pPr>
+        <w:pStyle w:val="Normal"/>
+        <w:tabs>
+          <w:tab w:val="clear" w:pos="720"/>
+          <w:tab w:val="right" w:pos="9360" w:leader="dot"/>
+        </w:tabs>
+        <w:spacing w:lineRule="auto" w:line="240" w:before="0" w:after="20"/>
+        <w:ind w:left="454"/>
+        <w:rPr>
+          <w:rFonts w:ascii="Times New Roman" w:hAnsi="Times New Roman" w:eastAsia="Times New Roman"/>
+          <w:b w:val="false"/>
+          <w:sz w:val="22"/>
+        </w:rPr>
+      </w:pPr>
+      <w:r>
+        <w:rPr>
+          <w:rFonts w:eastAsia="Times New Roman"/>
+          <w:b w:val="false"/>
+          <w:sz w:val="22"/>
+        </w:rPr>
+        <w:t>2.5 Posibilidades de análisis</w:t>
+        <w:tab/>
+        <w:t>6</w:t>
+      </w:r>
+    </w:p>
+    <w:p>
+      <w:pPr>
+        <w:pStyle w:val="Normal"/>
+        <w:tabs>
+          <w:tab w:val="clear" w:pos="720"/>
+          <w:tab w:val="right" w:pos="9360" w:leader="dot"/>
+        </w:tabs>
+        <w:spacing w:lineRule="auto" w:line="240" w:before="0" w:after="20"/>
+        <w:ind w:left="0"/>
+        <w:rPr>
+          <w:rFonts w:ascii="Times New Roman" w:hAnsi="Times New Roman" w:eastAsia="Times New Roman"/>
+          <w:b/>
+          <w:sz w:val="22"/>
+        </w:rPr>
+      </w:pPr>
+      <w:r>
+        <w:rPr>
+          <w:rFonts w:eastAsia="Times New Roman"/>
+          <w:b/>
+          <w:sz w:val="22"/>
+        </w:rPr>
+        <w:t>3. Problema de toma de decisiones</w:t>
+        <w:tab/>
+        <w:t>6</w:t>
+      </w:r>
+    </w:p>
+    <w:p>
+      <w:pPr>
+        <w:pStyle w:val="Normal"/>
+        <w:tabs>
+          <w:tab w:val="clear" w:pos="720"/>
+          <w:tab w:val="right" w:pos="9360" w:leader="dot"/>
+        </w:tabs>
+        <w:spacing w:lineRule="auto" w:line="240" w:before="0" w:after="20"/>
+        <w:ind w:left="454"/>
+        <w:rPr>
+          <w:rFonts w:ascii="Times New Roman" w:hAnsi="Times New Roman" w:eastAsia="Times New Roman"/>
+          <w:b w:val="false"/>
+          <w:sz w:val="22"/>
+        </w:rPr>
+      </w:pPr>
+      <w:r>
+        <w:rPr>
+          <w:rFonts w:eastAsia="Times New Roman"/>
+          <w:b w:val="false"/>
+          <w:sz w:val="22"/>
+        </w:rPr>
+        <w:t>3.1 Situación encontrada en los datos</w:t>
+        <w:tab/>
+        <w:t>6</w:t>
+      </w:r>
+    </w:p>
+    <w:p>
+      <w:pPr>
+        <w:pStyle w:val="Normal"/>
+        <w:tabs>
+          <w:tab w:val="clear" w:pos="720"/>
+          <w:tab w:val="right" w:pos="9360" w:leader="dot"/>
+        </w:tabs>
+        <w:spacing w:lineRule="auto" w:line="240" w:before="0" w:after="20"/>
+        <w:ind w:left="454"/>
+        <w:rPr>
+          <w:rFonts w:ascii="Times New Roman" w:hAnsi="Times New Roman" w:eastAsia="Times New Roman"/>
+          <w:b w:val="false"/>
+          <w:sz w:val="22"/>
+        </w:rPr>
+      </w:pPr>
+      <w:r>
+        <w:rPr>
+          <w:rFonts w:eastAsia="Times New Roman"/>
+          <w:b w:val="false"/>
+          <w:sz w:val="22"/>
+        </w:rPr>
+        <w:t>3.2 Problema y necesidad de información</w:t>
+        <w:tab/>
+        <w:t>7</w:t>
+      </w:r>
+    </w:p>
+    <w:p>
+      <w:pPr>
+        <w:pStyle w:val="Normal"/>
+        <w:tabs>
+          <w:tab w:val="clear" w:pos="720"/>
+          <w:tab w:val="right" w:pos="9360" w:leader="dot"/>
+        </w:tabs>
+        <w:spacing w:lineRule="auto" w:line="240" w:before="0" w:after="20"/>
+        <w:ind w:left="454"/>
+        <w:rPr>
+          <w:rFonts w:ascii="Times New Roman" w:hAnsi="Times New Roman" w:eastAsia="Times New Roman"/>
+          <w:b w:val="false"/>
+          <w:sz w:val="22"/>
+        </w:rPr>
+      </w:pPr>
+      <w:r>
+        <w:rPr>
+          <w:rFonts w:eastAsia="Times New Roman"/>
+          <w:b w:val="false"/>
+          <w:sz w:val="22"/>
+        </w:rPr>
+        <w:t>3.3 Usuarios de la solución</w:t>
+        <w:tab/>
+        <w:t>7</w:t>
+      </w:r>
+    </w:p>
+    <w:p>
+      <w:pPr>
+        <w:pStyle w:val="Normal"/>
+        <w:tabs>
+          <w:tab w:val="clear" w:pos="720"/>
+          <w:tab w:val="right" w:pos="9360" w:leader="dot"/>
+        </w:tabs>
+        <w:spacing w:lineRule="auto" w:line="240" w:before="0" w:after="20"/>
+        <w:ind w:left="454"/>
+        <w:rPr>
+          <w:rFonts w:ascii="Times New Roman" w:hAnsi="Times New Roman" w:eastAsia="Times New Roman"/>
+          <w:b w:val="false"/>
+          <w:sz w:val="22"/>
+        </w:rPr>
+      </w:pPr>
+      <w:r>
+        <w:rPr>
+          <w:rFonts w:eastAsia="Times New Roman"/>
+          <w:b w:val="false"/>
+          <w:sz w:val="22"/>
+        </w:rPr>
+        <w:t>3.4 Decisiones que se busca apoyar</w:t>
+        <w:tab/>
+        <w:t>7</w:t>
+      </w:r>
+    </w:p>
+    <w:p>
+      <w:pPr>
+        <w:pStyle w:val="Normal"/>
+        <w:tabs>
+          <w:tab w:val="clear" w:pos="720"/>
+          <w:tab w:val="right" w:pos="9360" w:leader="dot"/>
+        </w:tabs>
+        <w:spacing w:lineRule="auto" w:line="240" w:before="0" w:after="20"/>
+        <w:ind w:left="454"/>
+        <w:rPr>
+          <w:rFonts w:ascii="Times New Roman" w:hAnsi="Times New Roman" w:eastAsia="Times New Roman"/>
+          <w:b w:val="false"/>
+          <w:sz w:val="22"/>
+        </w:rPr>
+      </w:pPr>
+      <w:r>
+        <w:rPr>
+          <w:rFonts w:eastAsia="Times New Roman"/>
+          <w:b w:val="false"/>
+          <w:sz w:val="22"/>
+        </w:rPr>
+        <w:t>3.5 Preguntas de análisis</w:t>
+        <w:tab/>
+        <w:t>8</w:t>
+      </w:r>
+    </w:p>
+    <w:p>
+      <w:pPr>
+        <w:pStyle w:val="Normal"/>
+        <w:tabs>
+          <w:tab w:val="clear" w:pos="720"/>
+          <w:tab w:val="right" w:pos="9360" w:leader="dot"/>
+        </w:tabs>
+        <w:spacing w:lineRule="auto" w:line="240" w:before="0" w:after="20"/>
+        <w:ind w:left="0"/>
+        <w:rPr>
+          <w:rFonts w:ascii="Times New Roman" w:hAnsi="Times New Roman" w:eastAsia="Times New Roman"/>
+          <w:b/>
+          <w:sz w:val="22"/>
+        </w:rPr>
+      </w:pPr>
+      <w:r>
+        <w:rPr>
+          <w:rFonts w:eastAsia="Times New Roman"/>
+          <w:b/>
+          <w:sz w:val="22"/>
+        </w:rPr>
+        <w:t>4. Diseño del modelo dimensional</w:t>
+        <w:tab/>
+        <w:t>8</w:t>
+      </w:r>
+    </w:p>
+    <w:p>
+      <w:pPr>
+        <w:pStyle w:val="Normal"/>
+        <w:tabs>
+          <w:tab w:val="clear" w:pos="720"/>
+          <w:tab w:val="right" w:pos="9360" w:leader="dot"/>
+        </w:tabs>
+        <w:spacing w:lineRule="auto" w:line="240" w:before="0" w:after="20"/>
+        <w:ind w:left="454"/>
+        <w:rPr>
+          <w:rFonts w:ascii="Times New Roman" w:hAnsi="Times New Roman" w:eastAsia="Times New Roman"/>
+          <w:b w:val="false"/>
+          <w:sz w:val="22"/>
+        </w:rPr>
+      </w:pPr>
+      <w:r>
+        <w:rPr>
+          <w:rFonts w:eastAsia="Times New Roman"/>
+          <w:b w:val="false"/>
+          <w:sz w:val="22"/>
+        </w:rPr>
+        <w:t>4.1 Proceso de negocio y grano</w:t>
+        <w:tab/>
+        <w:t>8</w:t>
+      </w:r>
+    </w:p>
+    <w:p>
+      <w:pPr>
+        <w:pStyle w:val="Normal"/>
+        <w:tabs>
+          <w:tab w:val="clear" w:pos="720"/>
+          <w:tab w:val="right" w:pos="9360" w:leader="dot"/>
+        </w:tabs>
+        <w:spacing w:lineRule="auto" w:line="240" w:before="0" w:after="20"/>
+        <w:ind w:left="454"/>
+        <w:rPr>
+          <w:rFonts w:ascii="Times New Roman" w:hAnsi="Times New Roman" w:eastAsia="Times New Roman"/>
+          <w:b w:val="false"/>
+          <w:sz w:val="22"/>
+        </w:rPr>
+      </w:pPr>
+      <w:r>
+        <w:rPr>
+          <w:rFonts w:eastAsia="Times New Roman"/>
+          <w:b w:val="false"/>
+          <w:sz w:val="22"/>
+        </w:rPr>
+        <w:t>4.2 Medidas</w:t>
+        <w:tab/>
+        <w:t>8</w:t>
+      </w:r>
+    </w:p>
+    <w:p>
+      <w:pPr>
+        <w:pStyle w:val="Normal"/>
+        <w:tabs>
+          <w:tab w:val="clear" w:pos="720"/>
+          <w:tab w:val="right" w:pos="9360" w:leader="dot"/>
+        </w:tabs>
+        <w:spacing w:lineRule="auto" w:line="240" w:before="0" w:after="20"/>
+        <w:ind w:left="454"/>
+        <w:rPr>
+          <w:rFonts w:ascii="Times New Roman" w:hAnsi="Times New Roman" w:eastAsia="Times New Roman"/>
+          <w:b w:val="false"/>
+          <w:sz w:val="22"/>
+        </w:rPr>
+      </w:pPr>
+      <w:r>
+        <w:rPr>
+          <w:rFonts w:eastAsia="Times New Roman"/>
+          <w:b w:val="false"/>
+          <w:sz w:val="22"/>
+        </w:rPr>
+        <w:t>4.3 Dimensiones</w:t>
+        <w:tab/>
+        <w:t>9</w:t>
+      </w:r>
+    </w:p>
+    <w:p>
+      <w:pPr>
+        <w:pStyle w:val="Normal"/>
+        <w:tabs>
+          <w:tab w:val="clear" w:pos="720"/>
+          <w:tab w:val="right" w:pos="9360" w:leader="dot"/>
+        </w:tabs>
+        <w:spacing w:lineRule="auto" w:line="240" w:before="0" w:after="20"/>
+        <w:ind w:left="454"/>
+        <w:rPr>
+          <w:rFonts w:ascii="Times New Roman" w:hAnsi="Times New Roman" w:eastAsia="Times New Roman"/>
+          <w:b w:val="false"/>
+          <w:sz w:val="22"/>
+        </w:rPr>
+      </w:pPr>
+      <w:r>
+        <w:rPr>
+          <w:rFonts w:eastAsia="Times New Roman"/>
+          <w:b w:val="false"/>
+          <w:sz w:val="22"/>
+        </w:rPr>
+        <w:t>4.4 Esquema estrella</w:t>
+        <w:tab/>
+        <w:t>9</w:t>
+      </w:r>
+    </w:p>
+    <w:p>
+      <w:pPr>
+        <w:pStyle w:val="Normal"/>
+        <w:tabs>
+          <w:tab w:val="clear" w:pos="720"/>
+          <w:tab w:val="right" w:pos="9360" w:leader="dot"/>
+        </w:tabs>
+        <w:spacing w:lineRule="auto" w:line="240" w:before="0" w:after="20"/>
+        <w:ind w:left="454"/>
+        <w:rPr>
+          <w:rFonts w:ascii="Times New Roman" w:hAnsi="Times New Roman" w:eastAsia="Times New Roman"/>
+          <w:b w:val="false"/>
+          <w:sz w:val="22"/>
+        </w:rPr>
+      </w:pPr>
+      <w:r>
+        <w:rPr>
+          <w:rFonts w:eastAsia="Times New Roman"/>
+          <w:b w:val="false"/>
+          <w:sz w:val="22"/>
+        </w:rPr>
+        <w:t>4.5 Claves y relaciones</w:t>
+        <w:tab/>
+        <w:t>10</w:t>
+      </w:r>
+    </w:p>
+    <w:p>
+      <w:pPr>
+        <w:pStyle w:val="Normal"/>
+        <w:tabs>
+          <w:tab w:val="clear" w:pos="720"/>
+          <w:tab w:val="right" w:pos="9360" w:leader="dot"/>
+        </w:tabs>
+        <w:spacing w:lineRule="auto" w:line="240" w:before="0" w:after="20"/>
+        <w:ind w:left="454"/>
+        <w:rPr>
+          <w:rFonts w:ascii="Times New Roman" w:hAnsi="Times New Roman" w:eastAsia="Times New Roman"/>
+          <w:b w:val="false"/>
+          <w:sz w:val="22"/>
+        </w:rPr>
+      </w:pPr>
+      <w:r>
+        <w:rPr>
+          <w:rFonts w:eastAsia="Times New Roman"/>
+          <w:b w:val="false"/>
+          <w:sz w:val="22"/>
+        </w:rPr>
+        <w:t>4.6 Relación entre preguntas, medidas y dimensiones</w:t>
+        <w:tab/>
+        <w:t>11</w:t>
+      </w:r>
+    </w:p>
+    <w:p>
+      <w:pPr>
+        <w:pStyle w:val="Normal"/>
+        <w:tabs>
+          <w:tab w:val="clear" w:pos="720"/>
+          <w:tab w:val="right" w:pos="9360" w:leader="dot"/>
+        </w:tabs>
+        <w:spacing w:lineRule="auto" w:line="240" w:before="0" w:after="20"/>
+        <w:ind w:left="0"/>
+        <w:rPr>
+          <w:rFonts w:ascii="Times New Roman" w:hAnsi="Times New Roman" w:eastAsia="Times New Roman"/>
+          <w:b/>
+          <w:sz w:val="22"/>
+        </w:rPr>
+      </w:pPr>
+      <w:r>
+        <w:rPr>
+          <w:rFonts w:eastAsia="Times New Roman"/>
+          <w:b/>
+          <w:sz w:val="22"/>
+        </w:rPr>
+        <w:t>5. Implementación del Data Warehouse</w:t>
+        <w:tab/>
+        <w:t>11</w:t>
+      </w:r>
+    </w:p>
+    <w:p>
+      <w:pPr>
+        <w:pStyle w:val="Normal"/>
+        <w:tabs>
+          <w:tab w:val="clear" w:pos="720"/>
+          <w:tab w:val="right" w:pos="9360" w:leader="dot"/>
+        </w:tabs>
+        <w:spacing w:lineRule="auto" w:line="240" w:before="0" w:after="20"/>
+        <w:ind w:left="0"/>
+        <w:rPr>
+          <w:rFonts w:ascii="Times New Roman" w:hAnsi="Times New Roman" w:eastAsia="Times New Roman"/>
+          <w:b/>
+          <w:sz w:val="22"/>
+        </w:rPr>
+      </w:pPr>
+      <w:r>
+        <w:rPr>
+          <w:rFonts w:eastAsia="Times New Roman"/>
+          <w:b/>
+          <w:sz w:val="22"/>
+        </w:rPr>
+        <w:t>6. Proceso ETL en Tableau Prep</w:t>
+        <w:tab/>
+        <w:t>13</w:t>
+      </w:r>
+    </w:p>
+    <w:p>
+      <w:pPr>
+        <w:pStyle w:val="Normal"/>
+        <w:tabs>
+          <w:tab w:val="clear" w:pos="720"/>
+          <w:tab w:val="right" w:pos="9360" w:leader="dot"/>
+        </w:tabs>
+        <w:spacing w:lineRule="auto" w:line="240" w:before="0" w:after="20"/>
+        <w:ind w:left="0"/>
+        <w:rPr>
+          <w:rFonts w:ascii="Times New Roman" w:hAnsi="Times New Roman" w:eastAsia="Times New Roman"/>
+          <w:b/>
+          <w:sz w:val="22"/>
+        </w:rPr>
+      </w:pPr>
+      <w:r>
+        <w:rPr>
+          <w:rFonts w:eastAsia="Times New Roman"/>
+          <w:b/>
+          <w:sz w:val="22"/>
+        </w:rPr>
+        <w:t>7. Análisis de las medidas</w:t>
+        <w:tab/>
+        <w:t>15</w:t>
+      </w:r>
+    </w:p>
+    <w:p>
+      <w:pPr>
+        <w:pStyle w:val="Normal"/>
+        <w:tabs>
+          <w:tab w:val="clear" w:pos="720"/>
+          <w:tab w:val="right" w:pos="9360" w:leader="dot"/>
+        </w:tabs>
+        <w:spacing w:lineRule="auto" w:line="240" w:before="0" w:after="20"/>
+        <w:ind w:left="454"/>
+        <w:rPr>
+          <w:rFonts w:ascii="Times New Roman" w:hAnsi="Times New Roman" w:eastAsia="Times New Roman"/>
+          <w:b w:val="false"/>
+          <w:sz w:val="22"/>
+        </w:rPr>
+      </w:pPr>
+      <w:r>
+        <w:rPr>
+          <w:rFonts w:eastAsia="Times New Roman"/>
+          <w:b w:val="false"/>
+          <w:sz w:val="22"/>
+        </w:rPr>
+        <w:t>7.1 Medidas de FactVentas</w:t>
+        <w:tab/>
+        <w:t>15</w:t>
+      </w:r>
+    </w:p>
+    <w:p>
+      <w:pPr>
+        <w:pStyle w:val="Normal"/>
+        <w:tabs>
+          <w:tab w:val="clear" w:pos="720"/>
+          <w:tab w:val="right" w:pos="9360" w:leader="dot"/>
+        </w:tabs>
+        <w:spacing w:lineRule="auto" w:line="240" w:before="0" w:after="20"/>
+        <w:ind w:left="454"/>
+        <w:rPr>
+          <w:rFonts w:ascii="Times New Roman" w:hAnsi="Times New Roman" w:eastAsia="Times New Roman"/>
+          <w:b w:val="false"/>
+          <w:sz w:val="22"/>
+        </w:rPr>
+      </w:pPr>
+      <w:r>
+        <w:rPr>
+          <w:rFonts w:eastAsia="Times New Roman"/>
+          <w:b w:val="false"/>
+          <w:sz w:val="22"/>
+        </w:rPr>
+        <w:t>7.2 Medidas de FactDevoluciones</w:t>
+        <w:tab/>
+        <w:t>16</w:t>
+      </w:r>
+    </w:p>
+    <w:p>
+      <w:pPr>
+        <w:pStyle w:val="Normal"/>
+        <w:tabs>
+          <w:tab w:val="clear" w:pos="720"/>
+          <w:tab w:val="right" w:pos="9360" w:leader="dot"/>
+        </w:tabs>
+        <w:spacing w:lineRule="auto" w:line="240" w:before="0" w:after="20"/>
+        <w:ind w:left="454"/>
+        <w:rPr>
+          <w:rFonts w:ascii="Times New Roman" w:hAnsi="Times New Roman" w:eastAsia="Times New Roman"/>
+          <w:b w:val="false"/>
+          <w:sz w:val="22"/>
+        </w:rPr>
+      </w:pPr>
+      <w:r>
+        <w:rPr>
+          <w:rFonts w:eastAsia="Times New Roman"/>
+          <w:b w:val="false"/>
+          <w:sz w:val="22"/>
+        </w:rPr>
+        <w:t>7.3 Medida de FactPagos</w:t>
+        <w:tab/>
+        <w:t>17</w:t>
+      </w:r>
+    </w:p>
+    <w:p>
+      <w:pPr>
+        <w:pStyle w:val="Normal"/>
+        <w:tabs>
+          <w:tab w:val="clear" w:pos="720"/>
+          <w:tab w:val="right" w:pos="9360" w:leader="dot"/>
+        </w:tabs>
+        <w:spacing w:lineRule="auto" w:line="240" w:before="0" w:after="20"/>
+        <w:ind w:left="454"/>
+        <w:rPr>
+          <w:rFonts w:ascii="Times New Roman" w:hAnsi="Times New Roman" w:eastAsia="Times New Roman"/>
+          <w:b w:val="false"/>
+          <w:sz w:val="22"/>
+        </w:rPr>
+      </w:pPr>
+      <w:r>
+        <w:rPr>
+          <w:rFonts w:eastAsia="Times New Roman"/>
+          <w:b w:val="false"/>
+          <w:sz w:val="22"/>
+        </w:rPr>
+        <w:t>7.4 Indicadores calculados en el dashboard</w:t>
+        <w:tab/>
+        <w:t>17</w:t>
+      </w:r>
+    </w:p>
+    <w:p>
+      <w:pPr>
+        <w:pStyle w:val="Normal"/>
+        <w:tabs>
+          <w:tab w:val="clear" w:pos="720"/>
+          <w:tab w:val="right" w:pos="9360" w:leader="dot"/>
+        </w:tabs>
+        <w:spacing w:lineRule="auto" w:line="240" w:before="0" w:after="20"/>
+        <w:ind w:left="0"/>
+        <w:rPr>
+          <w:rFonts w:ascii="Times New Roman" w:hAnsi="Times New Roman" w:eastAsia="Times New Roman"/>
+          <w:b/>
+          <w:sz w:val="22"/>
+        </w:rPr>
+      </w:pPr>
+      <w:r>
+        <w:rPr>
+          <w:rFonts w:eastAsia="Times New Roman"/>
+          <w:b/>
+          <w:sz w:val="22"/>
+        </w:rPr>
+        <w:t>8. Dashboard interactivo</w:t>
+        <w:tab/>
+        <w:t>17</w:t>
+      </w:r>
+    </w:p>
+    <w:p>
+      <w:pPr>
+        <w:pStyle w:val="Normal"/>
+        <w:tabs>
+          <w:tab w:val="clear" w:pos="720"/>
+          <w:tab w:val="right" w:pos="9360" w:leader="dot"/>
+        </w:tabs>
+        <w:spacing w:lineRule="auto" w:line="240" w:before="0" w:after="20"/>
+        <w:ind w:left="454"/>
+        <w:rPr>
+          <w:rFonts w:ascii="Times New Roman" w:hAnsi="Times New Roman" w:eastAsia="Times New Roman"/>
+          <w:b w:val="false"/>
+          <w:sz w:val="22"/>
+        </w:rPr>
+      </w:pPr>
+      <w:r>
+        <w:rPr>
+          <w:rFonts w:eastAsia="Times New Roman"/>
+          <w:b w:val="false"/>
+          <w:sz w:val="22"/>
+        </w:rPr>
+        <w:t>8.1 Tablero 1: rentabilidad de la venta</w:t>
+        <w:tab/>
+        <w:t>18</w:t>
+      </w:r>
+    </w:p>
+    <w:p>
+      <w:pPr>
+        <w:pStyle w:val="Normal"/>
+        <w:tabs>
+          <w:tab w:val="clear" w:pos="720"/>
+          <w:tab w:val="right" w:pos="9360" w:leader="dot"/>
+        </w:tabs>
+        <w:spacing w:lineRule="auto" w:line="240" w:before="0" w:after="20"/>
+        <w:ind w:left="454"/>
+        <w:rPr>
+          <w:rFonts w:ascii="Times New Roman" w:hAnsi="Times New Roman" w:eastAsia="Times New Roman"/>
+          <w:b w:val="false"/>
+          <w:sz w:val="22"/>
+        </w:rPr>
+      </w:pPr>
+      <w:r>
+        <w:rPr>
+          <w:rFonts w:eastAsia="Times New Roman"/>
+          <w:b w:val="false"/>
+          <w:sz w:val="22"/>
+        </w:rPr>
+        <w:t>8.2 Tablero 2: devoluciones y proveedores</w:t>
+        <w:tab/>
+        <w:t>19</w:t>
+      </w:r>
+    </w:p>
+    <w:p>
+      <w:pPr>
+        <w:pStyle w:val="Normal"/>
+        <w:tabs>
+          <w:tab w:val="clear" w:pos="720"/>
+          <w:tab w:val="right" w:pos="9360" w:leader="dot"/>
+        </w:tabs>
+        <w:spacing w:lineRule="auto" w:line="240" w:before="0" w:after="20"/>
+        <w:ind w:left="454"/>
+        <w:rPr>
+          <w:rFonts w:ascii="Times New Roman" w:hAnsi="Times New Roman" w:eastAsia="Times New Roman"/>
+          <w:b w:val="false"/>
+          <w:sz w:val="22"/>
+        </w:rPr>
+      </w:pPr>
+      <w:r>
+        <w:rPr>
+          <w:rFonts w:eastAsia="Times New Roman"/>
+          <w:b w:val="false"/>
+          <w:sz w:val="22"/>
+        </w:rPr>
+        <w:t>8.3 Relación entre las preguntas y el dashboard</w:t>
+        <w:tab/>
+        <w:t>21</w:t>
+      </w:r>
+    </w:p>
+    <w:p>
+      <w:pPr>
+        <w:pStyle w:val="Normal"/>
+        <w:tabs>
+          <w:tab w:val="clear" w:pos="720"/>
+          <w:tab w:val="right" w:pos="9360" w:leader="dot"/>
+        </w:tabs>
+        <w:spacing w:lineRule="auto" w:line="240" w:before="0" w:after="20"/>
+        <w:ind w:left="0"/>
+        <w:rPr>
+          <w:rFonts w:ascii="Times New Roman" w:hAnsi="Times New Roman" w:eastAsia="Times New Roman"/>
+          <w:b/>
+          <w:sz w:val="22"/>
+        </w:rPr>
+      </w:pPr>
+      <w:r>
+        <w:rPr>
+          <w:rFonts w:eastAsia="Times New Roman"/>
+          <w:b/>
+          <w:sz w:val="22"/>
+        </w:rPr>
+        <w:t>9. Justificación de las principales decisiones de diseño</w:t>
+        <w:tab/>
+        <w:t>21</w:t>
+      </w:r>
+    </w:p>
+    <w:p>
+      <w:pPr>
+        <w:pStyle w:val="Normal"/>
+        <w:tabs>
+          <w:tab w:val="clear" w:pos="720"/>
+          <w:tab w:val="right" w:pos="9360" w:leader="dot"/>
+        </w:tabs>
+        <w:spacing w:lineRule="auto" w:line="240" w:before="0" w:after="20"/>
+        <w:ind w:left="0"/>
+        <w:rPr>
+          <w:rFonts w:ascii="Times New Roman" w:hAnsi="Times New Roman" w:eastAsia="Times New Roman"/>
+          <w:b/>
+          <w:sz w:val="22"/>
+        </w:rPr>
+      </w:pPr>
+      <w:r>
+        <w:rPr>
+          <w:rFonts w:eastAsia="Times New Roman"/>
+          <w:b/>
+          <w:sz w:val="22"/>
+        </w:rPr>
+        <w:t>10. Conclusiones</w:t>
+        <w:tab/>
+        <w:t>22</w:t>
+      </w:r>
+    </w:p>
+    <w:p>
+      <w:pPr>
+        <w:pStyle w:val="Normal"/>
+        <w:tabs>
+          <w:tab w:val="clear" w:pos="720"/>
+          <w:tab w:val="right" w:pos="9360" w:leader="dot"/>
+        </w:tabs>
+        <w:spacing w:lineRule="auto" w:line="240" w:before="0" w:after="20"/>
+        <w:ind w:left="0"/>
+        <w:rPr>
+          <w:rFonts w:ascii="Times New Roman" w:hAnsi="Times New Roman" w:eastAsia="Times New Roman"/>
+          <w:b/>
+          <w:sz w:val="22"/>
+        </w:rPr>
+      </w:pPr>
+      <w:r>
+        <w:rPr>
+          <w:rFonts w:eastAsia="Times New Roman"/>
+          <w:b/>
+          <w:sz w:val="22"/>
+        </w:rPr>
+        <w:t>Referencias</w:t>
+        <w:tab/>
+        <w:t>22</w:t>
+      </w:r>
+    </w:p>
+    <w:p>
+      <w:pPr>
+        <w:pStyle w:val="Normal"/>
+        <w:rPr/>
+      </w:pPr>
+      <w:r>
+        <w:rPr/>
+      </w:r>
+      <w:r>
+        <w:br w:type="page"/>
+      </w:r>
+    </w:p>
+    <w:p>
+      <w:pPr>
+        <w:pStyle w:val="Heading1"/>
+        <w:spacing w:before="0" w:after="120"/>
+        <w:rPr/>
+      </w:pPr>
+      <w:r>
+        <w:rPr/>
+        <w:t>1. Introducción</w:t>
+      </w:r>
+    </w:p>
+    <w:p>
+      <w:pPr>
+        <w:pStyle w:val="Normal"/>
+        <w:jc w:val="both"/>
+        <w:rPr>
+          <w:rFonts w:ascii="Times New Roman" w:hAnsi="Times New Roman" w:eastAsia="Times New Roman"/>
+          <w:sz w:val="24"/>
+        </w:rPr>
+      </w:pPr>
+      <w:r>
+        <w:rPr>
+          <w:rFonts w:eastAsia="Times New Roman"/>
+          <w:sz w:val="24"/>
+        </w:rPr>
+        <w:t>En esta práctica diseñamos e implementamos una solución de Inteligencia de Negocios completa a partir de la base de datos operacional BI_Practica_Retail, que se crea con el script entregado junto al enunciado. La base registra las ventas de una cadena de tiendas al detalle que vende en 12 sucursales físicas y por dos canales digitales (Web y App), entre el 1 de enero de 2023 y el 15 de agosto de 2026.</w:t>
+      </w:r>
+    </w:p>
+    <w:p>
+      <w:pPr>
+        <w:pStyle w:val="Normal"/>
+        <w:jc w:val="both"/>
+        <w:rPr>
+          <w:rFonts w:ascii="Times New Roman" w:hAnsi="Times New Roman" w:eastAsia="Times New Roman"/>
+          <w:sz w:val="24"/>
+        </w:rPr>
+      </w:pPr>
+      <w:r>
+        <w:rPr>
+          <w:rFonts w:eastAsia="Times New Roman"/>
+          <w:sz w:val="24"/>
+        </w:rPr>
+        <w:t>El trabajo siguió el orden que plantea el enunciado. Primero exploramos la fuente para entender sus tablas, su granularidad y sus problemas de calidad. Con eso definimos un problema de decisión y las preguntas de análisis que debía responder la solución. Luego diseñamos un modelo dimensional con la metodología de Kimball [1], lo implementamos como Data Warehouse en SQL Server, construimos el proceso ETL en Tableau Prep y, por último, desarrollamos un dashboard interactivo en Tableau Desktop que lee únicamente del Data Warehouse. Es el recorrido habitual de una solución de BI, que va de la integración de los datos a su análisis [2]. La Figura 1 lo resume.</w:t>
+      </w:r>
+    </w:p>
+    <w:p>
+      <w:pPr>
+        <w:pStyle w:val="Normal"/>
+        <w:keepNext w:val="true"/>
+        <w:spacing w:lineRule="auto" w:line="240"/>
+        <w:jc w:val="center"/>
+        <w:rPr/>
+      </w:pPr>
+      <w:r>
+        <w:rPr/>
+        <w:drawing>
+          <wp:inline distT="0" distB="0" distL="0" distR="0">
+            <wp:extent cx="5760085" cy="660400"/>
+            <wp:effectExtent l="0" t="0" r="0" b="0"/>
+            <wp:docPr id="2" name="Picture 2"/>
+            <wp:cNvGraphicFramePr>
+              <a:graphicFrameLocks xmlns:a="http://schemas.openxmlformats.org/drawingml/2006/main" noChangeAspect="1"/>
+            </wp:cNvGraphicFramePr>
+            <a:graphic xmlns:a="http://schemas.openxmlformats.org/drawingml/2006/main">
+              <a:graphicData uri="http://schemas.openxmlformats.org/drawingml/2006/picture">
+                <pic:pic xmlns:pic="http://schemas.openxmlformats.org/drawingml/2006/picture">
+                  <pic:nvPicPr>
+                    <pic:cNvPr id="2" name="Picture 2"/>
+                    <pic:cNvPicPr>
+                      <a:picLocks noChangeAspect="1" noChangeArrowheads="1"/>
+                    </pic:cNvPicPr>
+                  </pic:nvPicPr>
+                  <pic:blipFill>
+                    <a:blip r:embed="rId3"/>
                     <a:stretch>
                       <a:fillRect/>
                     </a:stretch>
@@ -6795,7 +6824,7 @@
           <wp:inline distT="0" distB="0" distL="0" distR="0">
             <wp:extent cx="5400040" cy="3839845"/>
             <wp:effectExtent l="0" t="0" r="0" b="0"/>
-            <wp:docPr id="2" name="Picture 2"/>
+            <wp:docPr id="3" name="Picture 3"/>
             <wp:cNvGraphicFramePr>
               <a:graphicFrameLocks xmlns:a="http://schemas.openxmlformats.org/drawingml/2006/main" noChangeAspect="1"/>
             </wp:cNvGraphicFramePr>
@@ -6803,13 +6832,13 @@
               <a:graphicData uri="http://schemas.openxmlformats.org/drawingml/2006/picture">
                 <pic:pic xmlns:pic="http://schemas.openxmlformats.org/drawingml/2006/picture">
                   <pic:nvPicPr>
-                    <pic:cNvPr id="2" name="Picture 2"/>
+                    <pic:cNvPr id="3" name="Picture 3"/>
                     <pic:cNvPicPr>
                       <a:picLocks noChangeAspect="1" noChangeArrowheads="1"/>
                     </pic:cNvPicPr>
                   </pic:nvPicPr>
                   <pic:blipFill>
-                    <a:blip r:embed="rId3"/>
+                    <a:blip r:embed="rId4"/>
                     <a:stretch>
                       <a:fillRect/>
                     </a:stretch>
@@ -10000,7 +10029,7 @@
           <wp:inline distT="0" distB="0" distL="0" distR="0">
             <wp:extent cx="3959860" cy="4949825"/>
             <wp:effectExtent l="0" t="0" r="0" b="0"/>
-            <wp:docPr id="3" name="Picture 3"/>
+            <wp:docPr id="4" name="Picture 4"/>
             <wp:cNvGraphicFramePr>
               <a:graphicFrameLocks xmlns:a="http://schemas.openxmlformats.org/drawingml/2006/main" noChangeAspect="1"/>
             </wp:cNvGraphicFramePr>
@@ -10008,13 +10037,13 @@
               <a:graphicData uri="http://schemas.openxmlformats.org/drawingml/2006/picture">
                 <pic:pic xmlns:pic="http://schemas.openxmlformats.org/drawingml/2006/picture">
                   <pic:nvPicPr>
-                    <pic:cNvPr id="3" name="Picture 3"/>
+                    <pic:cNvPr id="4" name="Picture 4"/>
                     <pic:cNvPicPr>
                       <a:picLocks noChangeAspect="1" noChangeArrowheads="1"/>
                     </pic:cNvPicPr>
                   </pic:nvPicPr>
                   <pic:blipFill>
-                    <a:blip r:embed="rId4"/>
+                    <a:blip r:embed="rId5"/>
                     <a:stretch>
                       <a:fillRect/>
                     </a:stretch>
@@ -13320,140 +13349,6 @@
       <w:r>
         <w:rPr/>
         <w:t>8.1 Tablero 1: rentabilidad de la venta</w:t>
-      </w:r>
-    </w:p>
-    <w:p>
-      <w:pPr>
-        <w:pStyle w:val="Normal"/>
-        <w:keepNext w:val="true"/>
-        <w:spacing w:lineRule="auto" w:line="240"/>
-        <w:jc w:val="center"/>
-        <w:rPr/>
-      </w:pPr>
-      <w:r>
-        <w:rPr/>
-        <w:drawing>
-          <wp:inline distT="0" distB="0" distL="0" distR="0">
-            <wp:extent cx="5760085" cy="3726180"/>
-            <wp:effectExtent l="0" t="0" r="0" b="0"/>
-            <wp:docPr id="4" name="Picture 4"/>
-            <wp:cNvGraphicFramePr>
-              <a:graphicFrameLocks xmlns:a="http://schemas.openxmlformats.org/drawingml/2006/main" noChangeAspect="1"/>
-            </wp:cNvGraphicFramePr>
-            <a:graphic xmlns:a="http://schemas.openxmlformats.org/drawingml/2006/main">
-              <a:graphicData uri="http://schemas.openxmlformats.org/drawingml/2006/picture">
-                <pic:pic xmlns:pic="http://schemas.openxmlformats.org/drawingml/2006/picture">
-                  <pic:nvPicPr>
-                    <pic:cNvPr id="4" name="Picture 4"/>
-                    <pic:cNvPicPr>
-                      <a:picLocks noChangeAspect="1" noChangeArrowheads="1"/>
-                    </pic:cNvPicPr>
-                  </pic:nvPicPr>
-                  <pic:blipFill>
-                    <a:blip r:embed="rId5"/>
-                    <a:stretch>
-                      <a:fillRect/>
-                    </a:stretch>
-                  </pic:blipFill>
-                  <pic:spPr bwMode="auto">
-                    <a:xfrm>
-                      <a:off x="0" y="0"/>
-                      <a:ext cx="5760085" cy="3726180"/>
-                    </a:xfrm>
-                    <a:prstGeom prst="rect">
-                      <a:avLst/>
-                    </a:prstGeom>
-                    <a:noFill/>
-                  </pic:spPr>
-                </pic:pic>
-              </a:graphicData>
-            </a:graphic>
-          </wp:inline>
-        </w:drawing>
-      </w:r>
-    </w:p>
-    <w:p>
-      <w:pPr>
-        <w:pStyle w:val="Normal"/>
-        <w:spacing w:lineRule="auto" w:line="240" w:before="0" w:after="240"/>
-        <w:jc w:val="center"/>
-        <w:rPr/>
-      </w:pPr>
-      <w:r>
-        <w:rPr>
-          <w:rFonts w:eastAsia="Times New Roman"/>
-          <w:b/>
-          <w:sz w:val="20"/>
-        </w:rPr>
-        <w:t xml:space="preserve">Figura 4. </w:t>
-      </w:r>
-      <w:r>
-        <w:rPr>
-          <w:rFonts w:eastAsia="Times New Roman"/>
-          <w:sz w:val="20"/>
-        </w:rPr>
-        <w:t>Tablero "Rentabilidad de la venta", sin filtros.</w:t>
-      </w:r>
-    </w:p>
-    <w:p>
-      <w:pPr>
-        <w:pStyle w:val="Normal"/>
-        <w:jc w:val="both"/>
-        <w:rPr>
-          <w:rFonts w:ascii="Times New Roman" w:hAnsi="Times New Roman" w:eastAsia="Times New Roman"/>
-          <w:sz w:val="24"/>
-        </w:rPr>
-      </w:pPr>
-      <w:r>
-        <w:rPr>
-          <w:rFonts w:eastAsia="Times New Roman"/>
-          <w:sz w:val="24"/>
-        </w:rPr>
-        <w:t>Las cifras de arriba resumen el período: venta neta de RD$289.0 millones, margen bruto de RD$75.6 millones (26.2%), 28,803 órdenes y un ticket promedio de RD$10,033. Para P1, el gráfico de categorías muestra que Papelería es la que más vende (RD$38.7 millones) pero la de menor margen (23.3%), mientras que Cuidado personal (27.9%) y Electrodomésticos (27.4%) son las más rentables.</w:t>
-      </w:r>
-    </w:p>
-    <w:p>
-      <w:pPr>
-        <w:pStyle w:val="Normal"/>
-        <w:jc w:val="both"/>
-        <w:rPr>
-          <w:rFonts w:ascii="Times New Roman" w:hAnsi="Times New Roman" w:eastAsia="Times New Roman"/>
-          <w:sz w:val="24"/>
-        </w:rPr>
-      </w:pPr>
-      <w:r>
-        <w:rPr>
-          <w:rFonts w:eastAsia="Times New Roman"/>
-          <w:sz w:val="24"/>
-        </w:rPr>
-        <w:t>Para P2, el margen cae a medida que la campaña da más descuento: San Valentín (10%) deja 20.4%, Madres (12%) 18.9%, Regreso a clases (15%) 15.9% y Black Friday (20%) apenas 11.0%, frente a 28.1% sin promoción. Como el ticket con promoción es menor, el descuento no se está compensando con más venta.</w:t>
-      </w:r>
-    </w:p>
-    <w:p>
-      <w:pPr>
-        <w:pStyle w:val="Normal"/>
-        <w:jc w:val="both"/>
-        <w:rPr>
-          <w:rFonts w:ascii="Times New Roman" w:hAnsi="Times New Roman" w:eastAsia="Times New Roman"/>
-          <w:sz w:val="24"/>
-        </w:rPr>
-      </w:pPr>
-      <w:r>
-        <w:rPr>
-          <w:rFonts w:eastAsia="Times New Roman"/>
-          <w:sz w:val="24"/>
-        </w:rPr>
-        <w:t>Para P5, la venta mensual se mueve entre RD$5.4 y 7.7 millones, con un promedio de RD$6.65 millones, y los meses más altos fueron marzo de 2025 y julio de 2024 y de 2025. Donde sí se ve un patrón es en el margen: agosto de cada año baja a cerca de 16% (15.8% en 2023 y 16.1% en 2024 y 2025), cuando corre la campaña de Regreso a clases, y noviembre de 2025, con Black Friday, baja a 22.7%. En el gráfico esos meses aparecen en un tono más claro. La última barra es baja porque agosto de 2026 solo tiene datos hasta el día 15. Para P6, el ticket promedio va de RD$9,385 a RD$10,205 y el margen de 25.8% a 26.5% en todas las combinaciones de canal y tipo de tienda; la mayor parte de la venta ocurre en tiendas físicas de centro comercial. Para P7, el segmento Regular aporta el 56.3% de la venta, Preferente el 24.3% y Corporativo el 11.5%, y el 7.8% de la venta no tiene cliente identificado.</w:t>
-      </w:r>
-    </w:p>
-    <w:p>
-      <w:pPr>
-        <w:pStyle w:val="Heading2"/>
-        <w:rPr/>
-      </w:pPr>
-      <w:r>
-        <w:rPr/>
-        <w:t>8.2 Tablero 2: devoluciones y proveedores</w:t>
       </w:r>
     </w:p>
     <w:p>
@@ -13519,14 +13414,14 @@
           <w:b/>
           <w:sz w:val="20"/>
         </w:rPr>
-        <w:t xml:space="preserve">Figura 5. </w:t>
+        <w:t xml:space="preserve">Figura 4. </w:t>
       </w:r>
       <w:r>
         <w:rPr>
           <w:rFonts w:eastAsia="Times New Roman"/>
           <w:sz w:val="20"/>
         </w:rPr>
-        <w:t>Tablero "Devoluciones y proveedores", sin filtros.</w:t>
+        <w:t>Tablero "Rentabilidad de la venta", sin filtros.</w:t>
       </w:r>
     </w:p>
     <w:p>
@@ -13543,7 +13438,7 @@
           <w:rFonts w:eastAsia="Times New Roman"/>
           <w:sz w:val="24"/>
         </w:rPr>
-        <w:t>En este tablero se ve que los reembolsos suman RD$13.2 millones, con una tasa de devolución de 7.0%, y que después de restarlos el margen baja de RD$75.6 a 62.5 millones: el 17.4% del margen se va en reembolsos. Para P3, Moda (14.0%), Electrodomésticos (10.0%) y Tecnología (9.3%) tienen tasas que duplican a las demás categorías, que están entre 4.7% y 5.1%, y los diez productos con más dinero reembolsado son de esas mismas categorías; el primero es el Producto 188, de Moda, con RD$232,410.</w:t>
+        <w:t>Las cifras de arriba resumen el período: venta neta de RD$289.0 millones, margen bruto de RD$75.6 millones (26.2%), 28,803 órdenes y un ticket promedio de RD$10,033. Para P1, el gráfico de categorías muestra que Papelería es la que más vende (RD$38.7 millones) pero la de menor margen (23.3%), mientras que Cuidado personal (27.9%) y Electrodomésticos (27.4%) son las más rentables.</w:t>
       </w:r>
     </w:p>
     <w:p>
@@ -13560,7 +13455,34 @@
           <w:rFonts w:eastAsia="Times New Roman"/>
           <w:sz w:val="24"/>
         </w:rPr>
-        <w:t>Para P4, Moda pierde el 35.9% de su margen en reembolsos, Electrodomésticos el 25.0% y Tecnología el 24.6%, mientras que Papelería, a pesar de tener el margen más bajo, solo pierde el 14.5%. Para P8, el gráfico de dispersión muestra que el Proveedor 03 tiene uno de los márgenes más altos (29.7%) pero también la mayor tasa de devolución (11.2%), que el Proveedor 13 tiene el margen más bajo (18.8%) y que los proveedores 24 y 01 combinan márgenes por encima de 31% con devoluciones bajas.</w:t>
+        <w:t>Para P2, el margen cae a medida que la campaña da más descuento: San Valentín (10%) deja 20.4%, Madres (12%) 18.9%, Regreso a clases (15%) 15.9% y Black Friday (20%) apenas 11.0%, frente a 28.1% sin promoción. Como el ticket con promoción es menor, el descuento no se está compensando con más venta.</w:t>
+      </w:r>
+    </w:p>
+    <w:p>
+      <w:pPr>
+        <w:pStyle w:val="Normal"/>
+        <w:jc w:val="both"/>
+        <w:rPr>
+          <w:rFonts w:ascii="Times New Roman" w:hAnsi="Times New Roman" w:eastAsia="Times New Roman"/>
+          <w:sz w:val="24"/>
+        </w:rPr>
+      </w:pPr>
+      <w:r>
+        <w:rPr>
+          <w:rFonts w:eastAsia="Times New Roman"/>
+          <w:sz w:val="24"/>
+        </w:rPr>
+        <w:t>Para P5, la venta mensual se mueve entre RD$5.4 y 7.7 millones, con un promedio de RD$6.65 millones, y los meses más altos fueron marzo de 2025 y julio de 2024 y de 2025. Donde sí se ve un patrón es en el margen: agosto de cada año baja a cerca de 16% (15.8% en 2023 y 16.1% en 2024 y 2025), cuando corre la campaña de Regreso a clases, y noviembre de 2025, con Black Friday, baja a 22.7%. En el gráfico esos meses aparecen en un tono más claro. La última barra es baja porque agosto de 2026 solo tiene datos hasta el día 15. Para P6, el ticket promedio va de RD$9,385 a RD$10,205 y el margen de 25.8% a 26.5% en todas las combinaciones de canal y tipo de tienda; la mayor parte de la venta ocurre en tiendas físicas de centro comercial. Para P7, el segmento Regular aporta el 56.3% de la venta, Preferente el 24.3% y Corporativo el 11.5%, y el 7.8% de la venta no tiene cliente identificado.</w:t>
+      </w:r>
+    </w:p>
+    <w:p>
+      <w:pPr>
+        <w:pStyle w:val="Heading2"/>
+        <w:rPr/>
+      </w:pPr>
+      <w:r>
+        <w:rPr/>
+        <w:t>8.2 Tablero 2: devoluciones y proveedores</w:t>
       </w:r>
     </w:p>
     <w:p>
@@ -13626,6 +13548,113 @@
           <w:b/>
           <w:sz w:val="20"/>
         </w:rPr>
+        <w:t xml:space="preserve">Figura 5. </w:t>
+      </w:r>
+      <w:r>
+        <w:rPr>
+          <w:rFonts w:eastAsia="Times New Roman"/>
+          <w:sz w:val="20"/>
+        </w:rPr>
+        <w:t>Tablero "Devoluciones y proveedores", sin filtros.</w:t>
+      </w:r>
+    </w:p>
+    <w:p>
+      <w:pPr>
+        <w:pStyle w:val="Normal"/>
+        <w:jc w:val="both"/>
+        <w:rPr>
+          <w:rFonts w:ascii="Times New Roman" w:hAnsi="Times New Roman" w:eastAsia="Times New Roman"/>
+          <w:sz w:val="24"/>
+        </w:rPr>
+      </w:pPr>
+      <w:r>
+        <w:rPr>
+          <w:rFonts w:eastAsia="Times New Roman"/>
+          <w:sz w:val="24"/>
+        </w:rPr>
+        <w:t>En este tablero se ve que los reembolsos suman RD$13.2 millones, con una tasa de devolución de 7.0%, y que después de restarlos el margen baja de RD$75.6 a 62.5 millones: el 17.4% del margen se va en reembolsos. Para P3, Moda (14.0%), Electrodomésticos (10.0%) y Tecnología (9.3%) tienen tasas que duplican a las demás categorías, que están entre 4.7% y 5.1%, y los diez productos con más dinero reembolsado son de esas mismas categorías; el primero es el Producto 188, de Moda, con RD$232,410.</w:t>
+      </w:r>
+    </w:p>
+    <w:p>
+      <w:pPr>
+        <w:pStyle w:val="Normal"/>
+        <w:jc w:val="both"/>
+        <w:rPr>
+          <w:rFonts w:ascii="Times New Roman" w:hAnsi="Times New Roman" w:eastAsia="Times New Roman"/>
+          <w:sz w:val="24"/>
+        </w:rPr>
+      </w:pPr>
+      <w:r>
+        <w:rPr>
+          <w:rFonts w:eastAsia="Times New Roman"/>
+          <w:sz w:val="24"/>
+        </w:rPr>
+        <w:t>Para P4, Moda pierde el 35.9% de su margen en reembolsos, Electrodomésticos el 25.0% y Tecnología el 24.6%, mientras que Papelería, a pesar de tener el margen más bajo, solo pierde el 14.5%. Para P8, el gráfico de dispersión muestra que el Proveedor 03 tiene uno de los márgenes más altos (29.7%) pero también la mayor tasa de devolución (11.2%), que el Proveedor 13 tiene el margen más bajo (18.8%) y que los proveedores 24 y 01 combinan márgenes por encima de 31% con devoluciones bajas.</w:t>
+      </w:r>
+    </w:p>
+    <w:p>
+      <w:pPr>
+        <w:pStyle w:val="Normal"/>
+        <w:keepNext w:val="true"/>
+        <w:spacing w:lineRule="auto" w:line="240"/>
+        <w:jc w:val="center"/>
+        <w:rPr/>
+      </w:pPr>
+      <w:r>
+        <w:rPr/>
+        <w:drawing>
+          <wp:inline distT="0" distB="0" distL="0" distR="0">
+            <wp:extent cx="5760085" cy="3726180"/>
+            <wp:effectExtent l="0" t="0" r="0" b="0"/>
+            <wp:docPr id="7" name="Picture 7"/>
+            <wp:cNvGraphicFramePr>
+              <a:graphicFrameLocks xmlns:a="http://schemas.openxmlformats.org/drawingml/2006/main" noChangeAspect="1"/>
+            </wp:cNvGraphicFramePr>
+            <a:graphic xmlns:a="http://schemas.openxmlformats.org/drawingml/2006/main">
+              <a:graphicData uri="http://schemas.openxmlformats.org/drawingml/2006/picture">
+                <pic:pic xmlns:pic="http://schemas.openxmlformats.org/drawingml/2006/picture">
+                  <pic:nvPicPr>
+                    <pic:cNvPr id="7" name="Picture 7"/>
+                    <pic:cNvPicPr>
+                      <a:picLocks noChangeAspect="1" noChangeArrowheads="1"/>
+                    </pic:cNvPicPr>
+                  </pic:nvPicPr>
+                  <pic:blipFill>
+                    <a:blip r:embed="rId8"/>
+                    <a:stretch>
+                      <a:fillRect/>
+                    </a:stretch>
+                  </pic:blipFill>
+                  <pic:spPr bwMode="auto">
+                    <a:xfrm>
+                      <a:off x="0" y="0"/>
+                      <a:ext cx="5760085" cy="3726180"/>
+                    </a:xfrm>
+                    <a:prstGeom prst="rect">
+                      <a:avLst/>
+                    </a:prstGeom>
+                    <a:noFill/>
+                  </pic:spPr>
+                </pic:pic>
+              </a:graphicData>
+            </a:graphic>
+          </wp:inline>
+        </w:drawing>
+      </w:r>
+    </w:p>
+    <w:p>
+      <w:pPr>
+        <w:pStyle w:val="Normal"/>
+        <w:spacing w:lineRule="auto" w:line="240" w:before="0" w:after="240"/>
+        <w:jc w:val="center"/>
+        <w:rPr/>
+      </w:pPr>
+      <w:r>
+        <w:rPr>
+          <w:rFonts w:eastAsia="Times New Roman"/>
+          <w:b/>
+          <w:sz w:val="20"/>
+        </w:rPr>
         <w:t xml:space="preserve">Figura 6. </w:t>
       </w:r>
       <w:r>
@@ -15347,8 +15376,8 @@
       </w:r>
     </w:p>
     <w:sectPr>
-      <w:footerReference w:type="default" r:id="rId8"/>
-      <w:footerReference w:type="first" r:id="rId9"/>
+      <w:footerReference w:type="default" r:id="rId9"/>
+      <w:footerReference w:type="first" r:id="rId10"/>
       <w:type w:val="nextPage"/>
       <w:pgSz w:w="12240" w:h="15840"/>
       <w:pgMar w:left="1440" w:right="1440" w:gutter="0" w:header="0" w:top="1440" w:footer="720" w:bottom="1440"/>

</xml_diff>